<commit_message>
Update Business Requirements Doc - System Components and Design - R.Castellanos.docx
</commit_message>
<xml_diff>
--- a/Assignments/Module 1/Business Requirements Doc - System Components and Design - R.Castellanos.docx
+++ b/Assignments/Module 1/Business Requirements Doc - System Components and Design - R.Castellanos.docx
@@ -1,6 +1,6 @@
 
 <file path=word/document.xml><?xml version="1.0" encoding="utf-8"?>
-<w:document xmlns:wpc="http://schemas.microsoft.com/office/word/2010/wordprocessingCanvas" xmlns:cx="http://schemas.microsoft.com/office/drawing/2014/chartex" xmlns:cx1="http://schemas.microsoft.com/office/drawing/2015/9/8/chartex" xmlns:cx2="http://schemas.microsoft.com/office/drawing/2015/10/21/chartex" xmlns:cx3="http://schemas.microsoft.com/office/drawing/2016/5/9/chartex" xmlns:cx4="http://schemas.microsoft.com/office/drawing/2016/5/10/chartex" xmlns:cx5="http://schemas.microsoft.com/office/drawing/2016/5/11/chartex" xmlns:cx6="http://schemas.microsoft.com/office/drawing/2016/5/12/chartex" xmlns:cx7="http://schemas.microsoft.com/office/drawing/2016/5/13/chartex" xmlns:cx8="http://schemas.microsoft.com/office/drawing/2016/5/14/chartex" xmlns:mc="http://schemas.openxmlformats.org/markup-compatibility/2006" xmlns:aink="http://schemas.microsoft.com/office/drawing/2016/ink" xmlns:am3d="http://schemas.microsoft.com/office/drawing/2017/model3d" xmlns:o="urn:schemas-microsoft-com:office:office" xmlns:oel="http://schemas.microsoft.com/office/2019/extlst" xmlns:r="http://schemas.openxmlformats.org/officeDocument/2006/relationships" xmlns:m="http://schemas.openxmlformats.org/officeDocument/2006/math" xmlns:v="urn:schemas-microsoft-com:vml" xmlns:wp14="http://schemas.microsoft.com/office/word/2010/wordprocessingDrawing" xmlns:wp="http://schemas.openxmlformats.org/drawingml/2006/wordprocessingDrawing" xmlns:w10="urn:schemas-microsoft-com:office:word" xmlns:w="http://schemas.openxmlformats.org/wordprocessingml/2006/main" xmlns:w14="http://schemas.microsoft.com/office/word/2010/wordml" xmlns:w15="http://schemas.microsoft.com/office/word/2012/wordml" xmlns:w16cex="http://schemas.microsoft.com/office/word/2018/wordml/cex" xmlns:w16cid="http://schemas.microsoft.com/office/word/2016/wordml/cid" xmlns:w16="http://schemas.microsoft.com/office/word/2018/wordml" xmlns:w16du="http://schemas.microsoft.com/office/word/2023/wordml/word16du" xmlns:w16sdtdh="http://schemas.microsoft.com/office/word/2020/wordml/sdtdatahash" xmlns:w16sdtfl="http://schemas.microsoft.com/office/word/2024/wordml/sdtformatlock" xmlns:w16se="http://schemas.microsoft.com/office/word/2015/wordml/symex" xmlns:wpg="http://schemas.microsoft.com/office/word/2010/wordprocessingGroup" xmlns:wpi="http://schemas.microsoft.com/office/word/2010/wordprocessingInk" xmlns:wne="http://schemas.microsoft.com/office/word/2006/wordml" xmlns:wps="http://schemas.microsoft.com/office/word/2010/wordprocessingShape" mc:Ignorable="w14 w15 w16se w16cid w16 w16cex w16sdtdh w16sdtfl w16du wp14">
+<w:document xmlns:wpc="http://schemas.microsoft.com/office/word/2010/wordprocessingCanvas" xmlns:cx="http://schemas.microsoft.com/office/drawing/2014/chartex" xmlns:cx1="http://schemas.microsoft.com/office/drawing/2015/9/8/chartex" xmlns:cx2="http://schemas.microsoft.com/office/drawing/2015/10/21/chartex" xmlns:cx3="http://schemas.microsoft.com/office/drawing/2016/5/9/chartex" xmlns:cx4="http://schemas.microsoft.com/office/drawing/2016/5/10/chartex" xmlns:cx5="http://schemas.microsoft.com/office/drawing/2016/5/11/chartex" xmlns:cx6="http://schemas.microsoft.com/office/drawing/2016/5/12/chartex" xmlns:cx7="http://schemas.microsoft.com/office/drawing/2016/5/13/chartex" xmlns:cx8="http://schemas.microsoft.com/office/drawing/2016/5/14/chartex" xmlns:mc="http://schemas.openxmlformats.org/markup-compatibility/2006" xmlns:aink="http://schemas.microsoft.com/office/drawing/2016/ink" xmlns:am3d="http://schemas.microsoft.com/office/drawing/2017/model3d" xmlns:o="urn:schemas-microsoft-com:office:office" xmlns:oel="http://schemas.microsoft.com/office/2019/extlst" xmlns:r="http://schemas.openxmlformats.org/officeDocument/2006/relationships" xmlns:m="http://schemas.openxmlformats.org/officeDocument/2006/math" xmlns:v="urn:schemas-microsoft-com:vml" xmlns:wp14="http://schemas.microsoft.com/office/word/2010/wordprocessingDrawing" xmlns:wp="http://schemas.openxmlformats.org/drawingml/2006/wordprocessingDrawing" xmlns:w10="urn:schemas-microsoft-com:office:word" xmlns:w="http://schemas.openxmlformats.org/wordprocessingml/2006/main" xmlns:w14="http://schemas.microsoft.com/office/word/2010/wordml" xmlns:w15="http://schemas.microsoft.com/office/word/2012/wordml" xmlns:w16cei="http://schemas.microsoft.com/office/word/2026/wordml/cei" xmlns:w16cex="http://schemas.microsoft.com/office/word/2018/wordml/cex" xmlns:w16cid="http://schemas.microsoft.com/office/word/2016/wordml/cid" xmlns:w16="http://schemas.microsoft.com/office/word/2018/wordml" xmlns:w16du="http://schemas.microsoft.com/office/word/2023/wordml/word16du" xmlns:w16sdtdh="http://schemas.microsoft.com/office/word/2020/wordml/sdtdatahash" xmlns:w16sdtfl="http://schemas.microsoft.com/office/word/2024/wordml/sdtformatlock" xmlns:w16se="http://schemas.microsoft.com/office/word/2015/wordml/symex" xmlns:wpg="http://schemas.microsoft.com/office/word/2010/wordprocessingGroup" xmlns:wpi="http://schemas.microsoft.com/office/word/2010/wordprocessingInk" xmlns:wne="http://schemas.microsoft.com/office/word/2006/wordml" xmlns:wps="http://schemas.microsoft.com/office/word/2010/wordprocessingShape" mc:Ignorable="w14 w15 w16se w16cid w16 w16cex w16sdtdh w16sdtfl w16du wp14">
   <w:body>
     <w:p>
       <w:pPr>
@@ -86,7 +86,7 @@
           <w:rFonts w:ascii="Calibri" w:eastAsia="Calibri" w:hAnsi="Calibri" w:cs="Calibri"/>
           <w:color w:val="000000"/>
         </w:rPr>
-        <w:t xml:space="preserve">Design a secure, cloud-based system for </w:t>
+        <w:t xml:space="preserve">Design a secure, cloud-based </w:t>
       </w:r>
       <w:proofErr w:type="spellStart"/>
       <w:r>
@@ -102,7 +102,7 @@
           <w:rFonts w:ascii="Calibri" w:eastAsia="Calibri" w:hAnsi="Calibri" w:cs="Calibri"/>
           <w:color w:val="000000"/>
         </w:rPr>
-        <w:t xml:space="preserve"> that helps students prepare for both the written and driving portions of the DMV licensing exam. </w:t>
+        <w:t xml:space="preserve"> system that helps students prepare for both the written and behind-the-wheel portions of the DMV licensing exam.</w:t>
       </w:r>
     </w:p>
     <w:p>
@@ -124,7 +124,7 @@
           <w:rFonts w:ascii="Calibri" w:eastAsia="Calibri" w:hAnsi="Calibri" w:cs="Calibri"/>
           <w:color w:val="000000"/>
         </w:rPr>
-        <w:t xml:space="preserve">Provide one centralized application where customers can register, access online learning materials and practice tests, purchase training packages, and schedule driving lessons. </w:t>
+        <w:t>Provide a centralized web application where customers can purchase training packages, complete online learning activities, schedule driving lessons, and monitor their progress.</w:t>
       </w:r>
     </w:p>
     <w:p>
@@ -162,7 +162,7 @@
           <w:rFonts w:ascii="Calibri" w:eastAsia="Calibri" w:hAnsi="Calibri" w:cs="Calibri"/>
           <w:color w:val="000000"/>
         </w:rPr>
-        <w:t xml:space="preserve"> operations by giving employees the tools to manage customers, appointments, instructors, vehicles, and reports through role-based access. </w:t>
+        <w:t xml:space="preserve"> operations by providing employees with tools to manage customers, appointments, instructors, vehicles, reports, and user accounts based on their assigned roles.</w:t>
       </w:r>
     </w:p>
     <w:p>
@@ -175,15 +175,53 @@
         <w:suppressAutoHyphens/>
         <w:spacing w:after="240" w:line="240" w:lineRule="auto"/>
         <w:rPr>
-          <w:rFonts w:ascii="Calibri" w:hAnsi="Calibri" w:cs="Calibri"/>
-        </w:rPr>
-      </w:pPr>
-      <w:r>
-        <w:rPr>
-          <w:rFonts w:ascii="Calibri" w:eastAsia="Calibri" w:hAnsi="Calibri" w:cs="Calibri"/>
-          <w:color w:val="000000"/>
-        </w:rPr>
-        <w:t>Build a flexible system that supports the company's current services while allowing</w:t>
+          <w:rFonts w:ascii="Calibri" w:eastAsia="Calibri" w:hAnsi="Calibri" w:cs="Calibri"/>
+          <w:color w:val="000000"/>
+        </w:rPr>
+      </w:pPr>
+      <w:r>
+        <w:rPr>
+          <w:rFonts w:ascii="Calibri" w:eastAsia="Calibri" w:hAnsi="Calibri" w:cs="Calibri"/>
+          <w:color w:val="000000"/>
+        </w:rPr>
+        <w:t>Support access from desktop and mobile devices while maintaining secure, centralized data storage.</w:t>
+      </w:r>
+    </w:p>
+    <w:p>
+      <w:pPr>
+        <w:pStyle w:val="ListParagraph"/>
+        <w:numPr>
+          <w:ilvl w:val="0"/>
+          <w:numId w:val="7"/>
+        </w:numPr>
+        <w:suppressAutoHyphens/>
+        <w:spacing w:after="240" w:line="240" w:lineRule="auto"/>
+        <w:rPr>
+          <w:rFonts w:ascii="Calibri" w:hAnsi="Calibri" w:cs="Calibri"/>
+        </w:rPr>
+      </w:pPr>
+      <w:r>
+        <w:rPr>
+          <w:rFonts w:ascii="Calibri" w:eastAsia="Calibri" w:hAnsi="Calibri" w:cs="Calibri"/>
+          <w:color w:val="000000"/>
+        </w:rPr>
+        <w:t xml:space="preserve">Build a scalable foundation that supports </w:t>
+      </w:r>
+      <w:proofErr w:type="spellStart"/>
+      <w:r>
+        <w:rPr>
+          <w:rFonts w:ascii="Calibri" w:eastAsia="Calibri" w:hAnsi="Calibri" w:cs="Calibri"/>
+          <w:color w:val="000000"/>
+        </w:rPr>
+        <w:t>DriverPass's</w:t>
+      </w:r>
+      <w:proofErr w:type="spellEnd"/>
+      <w:r>
+        <w:rPr>
+          <w:rFonts w:ascii="Calibri" w:eastAsia="Calibri" w:hAnsi="Calibri" w:cs="Calibri"/>
+          <w:color w:val="000000"/>
+        </w:rPr>
+        <w:t xml:space="preserve"> current services while allowing future enhancements, such as additional training packages or new learning modules, without requiring a complete redesign of the system.</w:t>
       </w:r>
     </w:p>
     <w:p>
@@ -270,33 +308,64 @@
     </w:p>
     <w:p>
       <w:pPr>
+        <w:suppressAutoHyphens/>
+        <w:spacing w:after="0" w:line="240" w:lineRule="auto"/>
+        <w:rPr>
+          <w:rFonts w:ascii="Calibri" w:hAnsi="Calibri" w:cs="Calibri"/>
+          <w:b/>
+          <w:bCs/>
+          <w:i/>
+        </w:rPr>
+      </w:pPr>
+      <w:r>
+        <w:rPr>
+          <w:rFonts w:ascii="Calibri" w:hAnsi="Calibri" w:cs="Calibri"/>
+          <w:b/>
+          <w:bCs/>
+          <w:i/>
+        </w:rPr>
+        <w:t>Business Need</w:t>
+      </w:r>
+    </w:p>
+    <w:p>
+      <w:pPr>
+        <w:suppressAutoHyphens/>
+        <w:spacing w:after="0" w:line="240" w:lineRule="auto"/>
+        <w:rPr>
+          <w:rFonts w:ascii="Calibri" w:hAnsi="Calibri" w:cs="Calibri"/>
+          <w:i/>
+        </w:rPr>
+      </w:pPr>
+    </w:p>
+    <w:p>
+      <w:pPr>
         <w:pStyle w:val="ListParagraph"/>
         <w:numPr>
           <w:ilvl w:val="0"/>
-          <w:numId w:val="8"/>
+          <w:numId w:val="10"/>
         </w:numPr>
         <w:suppressAutoHyphens/>
-        <w:spacing w:after="240" w:line="240" w:lineRule="auto"/>
-        <w:rPr>
-          <w:rFonts w:ascii="Calibri" w:eastAsia="Calibri" w:hAnsi="Calibri" w:cs="Calibri"/>
-          <w:color w:val="000000"/>
+        <w:spacing w:after="0" w:line="240" w:lineRule="auto"/>
+        <w:rPr>
+          <w:rFonts w:ascii="Calibri" w:hAnsi="Calibri" w:cs="Calibri"/>
+          <w:i/>
         </w:rPr>
       </w:pPr>
       <w:proofErr w:type="spellStart"/>
       <w:r>
         <w:rPr>
-          <w:rFonts w:ascii="Calibri" w:eastAsia="Calibri" w:hAnsi="Calibri" w:cs="Calibri"/>
-          <w:color w:val="000000"/>
+          <w:rFonts w:ascii="Calibri" w:hAnsi="Calibri" w:cs="Calibri"/>
+          <w:i/>
         </w:rPr>
         <w:t>DriverPass</w:t>
       </w:r>
       <w:proofErr w:type="spellEnd"/>
       <w:r>
         <w:rPr>
-          <w:rFonts w:ascii="Calibri" w:eastAsia="Calibri" w:hAnsi="Calibri" w:cs="Calibri"/>
-          <w:color w:val="000000"/>
-        </w:rPr>
-        <w:t xml:space="preserve"> was created to address the high number of students who fail DMV driving tests due to inadequate preparation. </w:t>
+          <w:rFonts w:ascii="Calibri" w:hAnsi="Calibri" w:cs="Calibri"/>
+          <w:i/>
+        </w:rPr>
+        <w:t xml:space="preserve"> was created to address the high failure rate among students taking DMV licensing exams.</w:t>
       </w:r>
     </w:p>
     <w:p>
@@ -304,59 +373,84 @@
         <w:pStyle w:val="ListParagraph"/>
         <w:numPr>
           <w:ilvl w:val="0"/>
-          <w:numId w:val="8"/>
+          <w:numId w:val="10"/>
         </w:numPr>
         <w:suppressAutoHyphens/>
-        <w:spacing w:after="240" w:line="240" w:lineRule="auto"/>
-        <w:rPr>
-          <w:rFonts w:ascii="Calibri" w:eastAsia="Calibri" w:hAnsi="Calibri" w:cs="Calibri"/>
-          <w:color w:val="000000"/>
-        </w:rPr>
-      </w:pPr>
-      <w:r>
-        <w:rPr>
-          <w:rFonts w:ascii="Calibri" w:eastAsia="Calibri" w:hAnsi="Calibri" w:cs="Calibri"/>
-          <w:color w:val="000000"/>
-        </w:rPr>
-        <w:t xml:space="preserve">The company plans to combine online learning, practice exams, classroom instruction, and behind-the-wheel training into a single system that is accessible through the web. </w:t>
-      </w:r>
+        <w:spacing w:after="0" w:line="240" w:lineRule="auto"/>
+        <w:rPr>
+          <w:rFonts w:ascii="Calibri" w:hAnsi="Calibri" w:cs="Calibri"/>
+          <w:i/>
+        </w:rPr>
+      </w:pPr>
+      <w:r>
+        <w:rPr>
+          <w:rFonts w:ascii="Calibri" w:hAnsi="Calibri" w:cs="Calibri"/>
+          <w:i/>
+        </w:rPr>
+        <w:t>The company believes that relying only on previous practice tests is insufficient preparation and wants to combine online learning with practical driving instruction.</w:t>
+      </w:r>
+    </w:p>
+    <w:p>
+      <w:pPr>
+        <w:suppressAutoHyphens/>
+        <w:spacing w:after="0" w:line="240" w:lineRule="auto"/>
+        <w:rPr>
+          <w:rFonts w:ascii="Calibri" w:hAnsi="Calibri" w:cs="Calibri"/>
+          <w:i/>
+        </w:rPr>
+      </w:pPr>
+    </w:p>
+    <w:p>
+      <w:pPr>
+        <w:suppressAutoHyphens/>
+        <w:spacing w:after="0" w:line="240" w:lineRule="auto"/>
+        <w:rPr>
+          <w:rFonts w:ascii="Calibri" w:hAnsi="Calibri" w:cs="Calibri"/>
+          <w:b/>
+          <w:bCs/>
+          <w:i/>
+        </w:rPr>
+      </w:pPr>
+      <w:r>
+        <w:rPr>
+          <w:rFonts w:ascii="Calibri" w:hAnsi="Calibri" w:cs="Calibri"/>
+          <w:b/>
+          <w:bCs/>
+          <w:i/>
+        </w:rPr>
+        <w:t>Customer Services</w:t>
+      </w:r>
+    </w:p>
+    <w:p>
+      <w:pPr>
+        <w:suppressAutoHyphens/>
+        <w:spacing w:after="0" w:line="240" w:lineRule="auto"/>
+        <w:rPr>
+          <w:rFonts w:ascii="Calibri" w:hAnsi="Calibri" w:cs="Calibri"/>
+          <w:i/>
+        </w:rPr>
+      </w:pPr>
     </w:p>
     <w:p>
       <w:pPr>
         <w:pStyle w:val="ListParagraph"/>
         <w:numPr>
           <w:ilvl w:val="0"/>
-          <w:numId w:val="8"/>
+          <w:numId w:val="11"/>
         </w:numPr>
         <w:suppressAutoHyphens/>
-        <w:spacing w:after="240" w:line="240" w:lineRule="auto"/>
-        <w:rPr>
-          <w:rFonts w:ascii="Calibri" w:eastAsia="Calibri" w:hAnsi="Calibri" w:cs="Calibri"/>
-          <w:color w:val="000000"/>
-        </w:rPr>
-      </w:pPr>
-      <w:r>
-        <w:rPr>
-          <w:rFonts w:ascii="Calibri" w:eastAsia="Calibri" w:hAnsi="Calibri" w:cs="Calibri"/>
-          <w:color w:val="000000"/>
-        </w:rPr>
-        <w:t xml:space="preserve">Customers should be able to register, purchase training packages, schedule lessons, monitor their progress, and communicate with </w:t>
-      </w:r>
-      <w:proofErr w:type="spellStart"/>
-      <w:r>
-        <w:rPr>
-          <w:rFonts w:ascii="Calibri" w:eastAsia="Calibri" w:hAnsi="Calibri" w:cs="Calibri"/>
-          <w:color w:val="000000"/>
-        </w:rPr>
-        <w:t>DriverPass</w:t>
-      </w:r>
-      <w:proofErr w:type="spellEnd"/>
-      <w:r>
-        <w:rPr>
-          <w:rFonts w:ascii="Calibri" w:eastAsia="Calibri" w:hAnsi="Calibri" w:cs="Calibri"/>
-          <w:color w:val="000000"/>
-        </w:rPr>
-        <w:t xml:space="preserve"> using the system. </w:t>
+        <w:spacing w:after="0" w:line="240" w:lineRule="auto"/>
+        <w:rPr>
+          <w:rFonts w:ascii="Calibri" w:hAnsi="Calibri" w:cs="Calibri"/>
+          <w:iCs/>
+        </w:rPr>
+      </w:pPr>
+      <w:r>
+        <w:rPr>
+          <w:rFonts w:ascii="Calibri" w:hAnsi="Calibri" w:cs="Calibri"/>
+          <w:iCs/>
+        </w:rPr>
+        <w:t>Customers can register for training packages.</w:t>
       </w:r>
     </w:p>
     <w:p>
@@ -364,21 +458,21 @@
         <w:pStyle w:val="ListParagraph"/>
         <w:numPr>
           <w:ilvl w:val="0"/>
-          <w:numId w:val="8"/>
+          <w:numId w:val="11"/>
         </w:numPr>
         <w:suppressAutoHyphens/>
-        <w:spacing w:after="240" w:line="240" w:lineRule="auto"/>
-        <w:rPr>
-          <w:rFonts w:ascii="Calibri" w:eastAsia="Calibri" w:hAnsi="Calibri" w:cs="Calibri"/>
-          <w:color w:val="000000"/>
-        </w:rPr>
-      </w:pPr>
-      <w:r>
-        <w:rPr>
-          <w:rFonts w:ascii="Calibri" w:eastAsia="Calibri" w:hAnsi="Calibri" w:cs="Calibri"/>
-          <w:color w:val="000000"/>
-        </w:rPr>
-        <w:t xml:space="preserve">Employees need tools to manage appointments, customer records, instructors, vehicles, and user accounts, while administrators require activity tracking and reporting. </w:t>
+        <w:spacing w:after="0" w:line="240" w:lineRule="auto"/>
+        <w:rPr>
+          <w:rFonts w:ascii="Calibri" w:hAnsi="Calibri" w:cs="Calibri"/>
+          <w:iCs/>
+        </w:rPr>
+      </w:pPr>
+      <w:r>
+        <w:rPr>
+          <w:rFonts w:ascii="Calibri" w:hAnsi="Calibri" w:cs="Calibri"/>
+          <w:iCs/>
+        </w:rPr>
+        <w:t>Customers can complete online classes and practice exams.</w:t>
       </w:r>
     </w:p>
     <w:p>
@@ -386,21 +480,504 @@
         <w:pStyle w:val="ListParagraph"/>
         <w:numPr>
           <w:ilvl w:val="0"/>
-          <w:numId w:val="8"/>
+          <w:numId w:val="11"/>
         </w:numPr>
         <w:suppressAutoHyphens/>
-        <w:spacing w:after="240" w:line="240" w:lineRule="auto"/>
-        <w:rPr>
-          <w:rFonts w:ascii="Calibri" w:hAnsi="Calibri" w:cs="Calibri"/>
-        </w:rPr>
-      </w:pPr>
-      <w:r>
-        <w:rPr>
-          <w:rFonts w:ascii="Calibri" w:eastAsia="Calibri" w:hAnsi="Calibri" w:cs="Calibri"/>
-          <w:color w:val="000000"/>
-        </w:rPr>
-        <w:t>The system should remain synchronized with DMV rule and practice test updates and be hosted in the cloud to reduce maintenance while providing reliable access from desktop and mobile devices.</w:t>
-      </w:r>
+        <w:spacing w:after="0" w:line="240" w:lineRule="auto"/>
+        <w:rPr>
+          <w:rFonts w:ascii="Calibri" w:hAnsi="Calibri" w:cs="Calibri"/>
+          <w:iCs/>
+        </w:rPr>
+      </w:pPr>
+      <w:r>
+        <w:rPr>
+          <w:rFonts w:ascii="Calibri" w:hAnsi="Calibri" w:cs="Calibri"/>
+          <w:iCs/>
+        </w:rPr>
+        <w:t>Customers can schedule, modify, or cancel driving lessons.</w:t>
+      </w:r>
+    </w:p>
+    <w:p>
+      <w:pPr>
+        <w:pStyle w:val="ListParagraph"/>
+        <w:numPr>
+          <w:ilvl w:val="0"/>
+          <w:numId w:val="11"/>
+        </w:numPr>
+        <w:suppressAutoHyphens/>
+        <w:spacing w:after="0" w:line="240" w:lineRule="auto"/>
+        <w:rPr>
+          <w:rFonts w:ascii="Calibri" w:hAnsi="Calibri" w:cs="Calibri"/>
+          <w:iCs/>
+        </w:rPr>
+      </w:pPr>
+      <w:r>
+        <w:rPr>
+          <w:rFonts w:ascii="Calibri" w:hAnsi="Calibri" w:cs="Calibri"/>
+          <w:iCs/>
+        </w:rPr>
+        <w:t xml:space="preserve">Customers can monitor </w:t>
+      </w:r>
+      <w:proofErr w:type="gramStart"/>
+      <w:r>
+        <w:rPr>
+          <w:rFonts w:ascii="Calibri" w:hAnsi="Calibri" w:cs="Calibri"/>
+          <w:iCs/>
+        </w:rPr>
+        <w:t>completed</w:t>
+      </w:r>
+      <w:proofErr w:type="gramEnd"/>
+      <w:r>
+        <w:rPr>
+          <w:rFonts w:ascii="Calibri" w:hAnsi="Calibri" w:cs="Calibri"/>
+          <w:iCs/>
+        </w:rPr>
+        <w:t xml:space="preserve"> and in-progress practice tests.</w:t>
+      </w:r>
+    </w:p>
+    <w:p>
+      <w:pPr>
+        <w:pStyle w:val="ListParagraph"/>
+        <w:numPr>
+          <w:ilvl w:val="0"/>
+          <w:numId w:val="11"/>
+        </w:numPr>
+        <w:suppressAutoHyphens/>
+        <w:spacing w:after="0" w:line="240" w:lineRule="auto"/>
+        <w:rPr>
+          <w:rFonts w:ascii="Calibri" w:hAnsi="Calibri" w:cs="Calibri"/>
+          <w:iCs/>
+        </w:rPr>
+      </w:pPr>
+      <w:r>
+        <w:rPr>
+          <w:rFonts w:ascii="Calibri" w:hAnsi="Calibri" w:cs="Calibri"/>
+          <w:iCs/>
+        </w:rPr>
+        <w:t>Customers can review instructor comments after driving lessons.</w:t>
+      </w:r>
+    </w:p>
+    <w:p>
+      <w:pPr>
+        <w:suppressAutoHyphens/>
+        <w:spacing w:after="0" w:line="240" w:lineRule="auto"/>
+        <w:rPr>
+          <w:rFonts w:ascii="Calibri" w:hAnsi="Calibri" w:cs="Calibri"/>
+          <w:b/>
+          <w:bCs/>
+          <w:i/>
+        </w:rPr>
+      </w:pPr>
+    </w:p>
+    <w:p>
+      <w:pPr>
+        <w:suppressAutoHyphens/>
+        <w:spacing w:after="0" w:line="240" w:lineRule="auto"/>
+        <w:rPr>
+          <w:rFonts w:ascii="Calibri" w:hAnsi="Calibri" w:cs="Calibri"/>
+          <w:b/>
+          <w:bCs/>
+          <w:i/>
+        </w:rPr>
+      </w:pPr>
+      <w:r>
+        <w:rPr>
+          <w:rFonts w:ascii="Calibri" w:hAnsi="Calibri" w:cs="Calibri"/>
+          <w:b/>
+          <w:bCs/>
+          <w:i/>
+        </w:rPr>
+        <w:t>Employee Services</w:t>
+      </w:r>
+    </w:p>
+    <w:p>
+      <w:pPr>
+        <w:suppressAutoHyphens/>
+        <w:spacing w:after="0" w:line="240" w:lineRule="auto"/>
+        <w:rPr>
+          <w:rFonts w:ascii="Calibri" w:hAnsi="Calibri" w:cs="Calibri"/>
+          <w:i/>
+        </w:rPr>
+      </w:pPr>
+    </w:p>
+    <w:p>
+      <w:pPr>
+        <w:pStyle w:val="ListParagraph"/>
+        <w:numPr>
+          <w:ilvl w:val="0"/>
+          <w:numId w:val="12"/>
+        </w:numPr>
+        <w:suppressAutoHyphens/>
+        <w:spacing w:after="0" w:line="240" w:lineRule="auto"/>
+        <w:rPr>
+          <w:rFonts w:ascii="Calibri" w:hAnsi="Calibri" w:cs="Calibri"/>
+          <w:iCs/>
+        </w:rPr>
+      </w:pPr>
+      <w:r>
+        <w:rPr>
+          <w:rFonts w:ascii="Calibri" w:hAnsi="Calibri" w:cs="Calibri"/>
+          <w:iCs/>
+        </w:rPr>
+        <w:t>Secretaries can register customers and schedule appointments.</w:t>
+      </w:r>
+    </w:p>
+    <w:p>
+      <w:pPr>
+        <w:pStyle w:val="ListParagraph"/>
+        <w:numPr>
+          <w:ilvl w:val="0"/>
+          <w:numId w:val="12"/>
+        </w:numPr>
+        <w:suppressAutoHyphens/>
+        <w:spacing w:after="0" w:line="240" w:lineRule="auto"/>
+        <w:rPr>
+          <w:rFonts w:ascii="Calibri" w:hAnsi="Calibri" w:cs="Calibri"/>
+          <w:iCs/>
+        </w:rPr>
+      </w:pPr>
+      <w:r>
+        <w:rPr>
+          <w:rFonts w:ascii="Calibri" w:hAnsi="Calibri" w:cs="Calibri"/>
+          <w:iCs/>
+        </w:rPr>
+        <w:t>Employees assign customers to available instructors and vehicles.</w:t>
+      </w:r>
+    </w:p>
+    <w:p>
+      <w:pPr>
+        <w:pStyle w:val="ListParagraph"/>
+        <w:numPr>
+          <w:ilvl w:val="0"/>
+          <w:numId w:val="12"/>
+        </w:numPr>
+        <w:suppressAutoHyphens/>
+        <w:spacing w:after="0" w:line="240" w:lineRule="auto"/>
+        <w:rPr>
+          <w:rFonts w:ascii="Calibri" w:hAnsi="Calibri" w:cs="Calibri"/>
+          <w:iCs/>
+        </w:rPr>
+      </w:pPr>
+      <w:r>
+        <w:rPr>
+          <w:rFonts w:ascii="Calibri" w:hAnsi="Calibri" w:cs="Calibri"/>
+          <w:iCs/>
+        </w:rPr>
+        <w:t>Employees manage reservations and customer records.</w:t>
+      </w:r>
+    </w:p>
+    <w:p>
+      <w:pPr>
+        <w:pStyle w:val="ListParagraph"/>
+        <w:numPr>
+          <w:ilvl w:val="0"/>
+          <w:numId w:val="12"/>
+        </w:numPr>
+        <w:suppressAutoHyphens/>
+        <w:spacing w:after="0" w:line="240" w:lineRule="auto"/>
+        <w:rPr>
+          <w:rFonts w:ascii="Calibri" w:hAnsi="Calibri" w:cs="Calibri"/>
+          <w:iCs/>
+        </w:rPr>
+      </w:pPr>
+      <w:r>
+        <w:rPr>
+          <w:rFonts w:ascii="Calibri" w:hAnsi="Calibri" w:cs="Calibri"/>
+          <w:iCs/>
+        </w:rPr>
+        <w:t>Employees assist customers with scheduling over the phone or in person.</w:t>
+      </w:r>
+    </w:p>
+    <w:p>
+      <w:pPr>
+        <w:suppressAutoHyphens/>
+        <w:spacing w:after="0" w:line="240" w:lineRule="auto"/>
+        <w:rPr>
+          <w:rFonts w:ascii="Calibri" w:hAnsi="Calibri" w:cs="Calibri"/>
+          <w:i/>
+        </w:rPr>
+      </w:pPr>
+    </w:p>
+    <w:p>
+      <w:pPr>
+        <w:suppressAutoHyphens/>
+        <w:spacing w:after="0" w:line="240" w:lineRule="auto"/>
+        <w:rPr>
+          <w:rFonts w:ascii="Calibri" w:hAnsi="Calibri" w:cs="Calibri"/>
+          <w:b/>
+          <w:bCs/>
+          <w:i/>
+        </w:rPr>
+      </w:pPr>
+      <w:r>
+        <w:rPr>
+          <w:rFonts w:ascii="Calibri" w:hAnsi="Calibri" w:cs="Calibri"/>
+          <w:b/>
+          <w:bCs/>
+          <w:i/>
+        </w:rPr>
+        <w:lastRenderedPageBreak/>
+        <w:t>Administrative Services</w:t>
+      </w:r>
+    </w:p>
+    <w:p>
+      <w:pPr>
+        <w:suppressAutoHyphens/>
+        <w:spacing w:after="0" w:line="240" w:lineRule="auto"/>
+        <w:rPr>
+          <w:rFonts w:ascii="Calibri" w:hAnsi="Calibri" w:cs="Calibri"/>
+          <w:i/>
+        </w:rPr>
+      </w:pPr>
+    </w:p>
+    <w:p>
+      <w:pPr>
+        <w:pStyle w:val="ListParagraph"/>
+        <w:numPr>
+          <w:ilvl w:val="0"/>
+          <w:numId w:val="13"/>
+        </w:numPr>
+        <w:suppressAutoHyphens/>
+        <w:spacing w:after="0" w:line="240" w:lineRule="auto"/>
+        <w:rPr>
+          <w:rFonts w:ascii="Calibri" w:hAnsi="Calibri" w:cs="Calibri"/>
+          <w:iCs/>
+        </w:rPr>
+      </w:pPr>
+      <w:r>
+        <w:rPr>
+          <w:rFonts w:ascii="Calibri" w:hAnsi="Calibri" w:cs="Calibri"/>
+          <w:iCs/>
+        </w:rPr>
+        <w:t>Administrators manage user accounts and permissions.</w:t>
+      </w:r>
+    </w:p>
+    <w:p>
+      <w:pPr>
+        <w:pStyle w:val="ListParagraph"/>
+        <w:numPr>
+          <w:ilvl w:val="0"/>
+          <w:numId w:val="13"/>
+        </w:numPr>
+        <w:suppressAutoHyphens/>
+        <w:spacing w:after="0" w:line="240" w:lineRule="auto"/>
+        <w:rPr>
+          <w:rFonts w:ascii="Calibri" w:hAnsi="Calibri" w:cs="Calibri"/>
+          <w:iCs/>
+        </w:rPr>
+      </w:pPr>
+      <w:r>
+        <w:rPr>
+          <w:rFonts w:ascii="Calibri" w:hAnsi="Calibri" w:cs="Calibri"/>
+          <w:iCs/>
+        </w:rPr>
+        <w:t>IT staff reset passwords and disable employee accounts when necessary.</w:t>
+      </w:r>
+    </w:p>
+    <w:p>
+      <w:pPr>
+        <w:pStyle w:val="ListParagraph"/>
+        <w:numPr>
+          <w:ilvl w:val="0"/>
+          <w:numId w:val="13"/>
+        </w:numPr>
+        <w:suppressAutoHyphens/>
+        <w:spacing w:after="0" w:line="240" w:lineRule="auto"/>
+        <w:rPr>
+          <w:rFonts w:ascii="Calibri" w:hAnsi="Calibri" w:cs="Calibri"/>
+          <w:iCs/>
+        </w:rPr>
+      </w:pPr>
+      <w:r>
+        <w:rPr>
+          <w:rFonts w:ascii="Calibri" w:hAnsi="Calibri" w:cs="Calibri"/>
+          <w:iCs/>
+        </w:rPr>
+        <w:t>Management generates activity reports showing who created, modified, or canceled reservations.</w:t>
+      </w:r>
+    </w:p>
+    <w:p>
+      <w:pPr>
+        <w:pStyle w:val="ListParagraph"/>
+        <w:numPr>
+          <w:ilvl w:val="0"/>
+          <w:numId w:val="13"/>
+        </w:numPr>
+        <w:suppressAutoHyphens/>
+        <w:spacing w:after="0" w:line="240" w:lineRule="auto"/>
+        <w:rPr>
+          <w:rFonts w:ascii="Calibri" w:hAnsi="Calibri" w:cs="Calibri"/>
+          <w:iCs/>
+        </w:rPr>
+      </w:pPr>
+      <w:r>
+        <w:rPr>
+          <w:rFonts w:ascii="Calibri" w:hAnsi="Calibri" w:cs="Calibri"/>
+          <w:iCs/>
+        </w:rPr>
+        <w:t>Administrators receive notifications when DMV information changes.</w:t>
+      </w:r>
+    </w:p>
+    <w:p>
+      <w:pPr>
+        <w:suppressAutoHyphens/>
+        <w:spacing w:after="0" w:line="240" w:lineRule="auto"/>
+        <w:rPr>
+          <w:rFonts w:ascii="Calibri" w:hAnsi="Calibri" w:cs="Calibri"/>
+          <w:iCs/>
+        </w:rPr>
+      </w:pPr>
+    </w:p>
+    <w:p>
+      <w:pPr>
+        <w:suppressAutoHyphens/>
+        <w:spacing w:after="0" w:line="240" w:lineRule="auto"/>
+        <w:rPr>
+          <w:rFonts w:ascii="Calibri" w:hAnsi="Calibri" w:cs="Calibri"/>
+          <w:b/>
+          <w:bCs/>
+          <w:i/>
+        </w:rPr>
+      </w:pPr>
+      <w:r>
+        <w:rPr>
+          <w:rFonts w:ascii="Calibri" w:hAnsi="Calibri" w:cs="Calibri"/>
+          <w:b/>
+          <w:bCs/>
+          <w:i/>
+        </w:rPr>
+        <w:t>Technical Components</w:t>
+      </w:r>
+    </w:p>
+    <w:p>
+      <w:pPr>
+        <w:suppressAutoHyphens/>
+        <w:spacing w:after="0" w:line="240" w:lineRule="auto"/>
+        <w:rPr>
+          <w:rFonts w:ascii="Calibri" w:hAnsi="Calibri" w:cs="Calibri"/>
+          <w:i/>
+        </w:rPr>
+      </w:pPr>
+    </w:p>
+    <w:p>
+      <w:pPr>
+        <w:pStyle w:val="ListParagraph"/>
+        <w:numPr>
+          <w:ilvl w:val="0"/>
+          <w:numId w:val="14"/>
+        </w:numPr>
+        <w:suppressAutoHyphens/>
+        <w:spacing w:after="0" w:line="240" w:lineRule="auto"/>
+        <w:rPr>
+          <w:rFonts w:ascii="Calibri" w:hAnsi="Calibri" w:cs="Calibri"/>
+          <w:iCs/>
+        </w:rPr>
+      </w:pPr>
+      <w:r>
+        <w:rPr>
+          <w:rFonts w:ascii="Calibri" w:hAnsi="Calibri" w:cs="Calibri"/>
+          <w:iCs/>
+        </w:rPr>
+        <w:t>Cloud-hosted web application.</w:t>
+      </w:r>
+    </w:p>
+    <w:p>
+      <w:pPr>
+        <w:pStyle w:val="ListParagraph"/>
+        <w:numPr>
+          <w:ilvl w:val="0"/>
+          <w:numId w:val="14"/>
+        </w:numPr>
+        <w:suppressAutoHyphens/>
+        <w:spacing w:after="0" w:line="240" w:lineRule="auto"/>
+        <w:rPr>
+          <w:rFonts w:ascii="Calibri" w:hAnsi="Calibri" w:cs="Calibri"/>
+          <w:iCs/>
+        </w:rPr>
+      </w:pPr>
+      <w:r>
+        <w:rPr>
+          <w:rFonts w:ascii="Calibri" w:hAnsi="Calibri" w:cs="Calibri"/>
+          <w:iCs/>
+        </w:rPr>
+        <w:t>Central database for customer, appointment, and lesson information.</w:t>
+      </w:r>
+    </w:p>
+    <w:p>
+      <w:pPr>
+        <w:pStyle w:val="ListParagraph"/>
+        <w:numPr>
+          <w:ilvl w:val="0"/>
+          <w:numId w:val="14"/>
+        </w:numPr>
+        <w:suppressAutoHyphens/>
+        <w:spacing w:after="0" w:line="240" w:lineRule="auto"/>
+        <w:rPr>
+          <w:rFonts w:ascii="Calibri" w:hAnsi="Calibri" w:cs="Calibri"/>
+          <w:iCs/>
+        </w:rPr>
+      </w:pPr>
+      <w:r>
+        <w:rPr>
+          <w:rFonts w:ascii="Calibri" w:hAnsi="Calibri" w:cs="Calibri"/>
+          <w:iCs/>
+        </w:rPr>
+        <w:t>Browser-based interface accessible from desktop and mobile devices.</w:t>
+      </w:r>
+    </w:p>
+    <w:p>
+      <w:pPr>
+        <w:pStyle w:val="ListParagraph"/>
+        <w:numPr>
+          <w:ilvl w:val="0"/>
+          <w:numId w:val="14"/>
+        </w:numPr>
+        <w:suppressAutoHyphens/>
+        <w:spacing w:after="0" w:line="240" w:lineRule="auto"/>
+        <w:rPr>
+          <w:rFonts w:ascii="Calibri" w:hAnsi="Calibri" w:cs="Calibri"/>
+          <w:iCs/>
+        </w:rPr>
+      </w:pPr>
+      <w:r>
+        <w:rPr>
+          <w:rFonts w:ascii="Calibri" w:hAnsi="Calibri" w:cs="Calibri"/>
+          <w:iCs/>
+        </w:rPr>
+        <w:t>Integration with DMV updates to keep practice materials current.</w:t>
+      </w:r>
+    </w:p>
+    <w:p>
+      <w:pPr>
+        <w:pStyle w:val="ListParagraph"/>
+        <w:numPr>
+          <w:ilvl w:val="0"/>
+          <w:numId w:val="14"/>
+        </w:numPr>
+        <w:suppressAutoHyphens/>
+        <w:spacing w:after="0" w:line="240" w:lineRule="auto"/>
+        <w:rPr>
+          <w:rFonts w:ascii="Calibri" w:hAnsi="Calibri" w:cs="Calibri"/>
+          <w:iCs/>
+        </w:rPr>
+      </w:pPr>
+      <w:r>
+        <w:rPr>
+          <w:rFonts w:ascii="Calibri" w:hAnsi="Calibri" w:cs="Calibri"/>
+          <w:iCs/>
+        </w:rPr>
+        <w:t>Reporting tools capable of exporting information for offline review.</w:t>
+      </w:r>
+    </w:p>
+    <w:p>
+      <w:pPr>
+        <w:suppressAutoHyphens/>
+        <w:spacing w:after="0" w:line="240" w:lineRule="auto"/>
+        <w:rPr>
+          <w:rFonts w:ascii="Calibri" w:hAnsi="Calibri" w:cs="Calibri"/>
+          <w:i/>
+        </w:rPr>
+      </w:pPr>
     </w:p>
     <w:p>
       <w:pPr>
@@ -462,18 +1039,16 @@
           <w:numId w:val="9"/>
         </w:numPr>
         <w:suppressAutoHyphens/>
-        <w:spacing w:after="240" w:line="240" w:lineRule="auto"/>
-        <w:rPr>
-          <w:rFonts w:ascii="Calibri" w:eastAsia="Calibri" w:hAnsi="Calibri" w:cs="Calibri"/>
-          <w:color w:val="000000"/>
-        </w:rPr>
-      </w:pPr>
-      <w:r>
-        <w:rPr>
-          <w:rFonts w:ascii="Calibri" w:eastAsia="Calibri" w:hAnsi="Calibri" w:cs="Calibri"/>
-          <w:color w:val="000000"/>
-        </w:rPr>
-        <w:t xml:space="preserve">Allow customers to create accounts, securely log in, purchase training packages, and schedule, modify, or cancel driving lessons online. </w:t>
+        <w:spacing w:after="240"/>
+        <w:rPr>
+          <w:rFonts w:ascii="Calibri" w:hAnsi="Calibri" w:cs="Calibri"/>
+        </w:rPr>
+      </w:pPr>
+      <w:r>
+        <w:rPr>
+          <w:rFonts w:ascii="Calibri" w:hAnsi="Calibri" w:cs="Calibri"/>
+        </w:rPr>
+        <w:t xml:space="preserve">Allow customers to securely create accounts and log in to the system. </w:t>
       </w:r>
     </w:p>
     <w:p>
@@ -484,18 +1059,16 @@
           <w:numId w:val="9"/>
         </w:numPr>
         <w:suppressAutoHyphens/>
-        <w:spacing w:after="240" w:line="240" w:lineRule="auto"/>
-        <w:rPr>
-          <w:rFonts w:ascii="Calibri" w:eastAsia="Calibri" w:hAnsi="Calibri" w:cs="Calibri"/>
-          <w:color w:val="000000"/>
-        </w:rPr>
-      </w:pPr>
-      <w:r>
-        <w:rPr>
-          <w:rFonts w:ascii="Calibri" w:eastAsia="Calibri" w:hAnsi="Calibri" w:cs="Calibri"/>
-          <w:color w:val="000000"/>
-        </w:rPr>
-        <w:t xml:space="preserve">Enable office staff to manage customer registrations, appointments, and instructor or vehicle assignments while preventing scheduling conflicts. </w:t>
+        <w:spacing w:after="240"/>
+        <w:rPr>
+          <w:rFonts w:ascii="Calibri" w:hAnsi="Calibri" w:cs="Calibri"/>
+        </w:rPr>
+      </w:pPr>
+      <w:r>
+        <w:rPr>
+          <w:rFonts w:ascii="Calibri" w:hAnsi="Calibri" w:cs="Calibri"/>
+        </w:rPr>
+        <w:t xml:space="preserve">Allow customers to purchase available training packages. </w:t>
       </w:r>
     </w:p>
     <w:p>
@@ -506,18 +1079,16 @@
           <w:numId w:val="9"/>
         </w:numPr>
         <w:suppressAutoHyphens/>
-        <w:spacing w:after="240" w:line="240" w:lineRule="auto"/>
-        <w:rPr>
-          <w:rFonts w:ascii="Calibri" w:eastAsia="Calibri" w:hAnsi="Calibri" w:cs="Calibri"/>
-          <w:color w:val="000000"/>
-        </w:rPr>
-      </w:pPr>
-      <w:r>
-        <w:rPr>
-          <w:rFonts w:ascii="Calibri" w:eastAsia="Calibri" w:hAnsi="Calibri" w:cs="Calibri"/>
-          <w:color w:val="000000"/>
-        </w:rPr>
-        <w:t xml:space="preserve">Maintain customer records, lesson history, instructor notes, online test progress, and an audit trail of important system activities. </w:t>
+        <w:spacing w:after="240"/>
+        <w:rPr>
+          <w:rFonts w:ascii="Calibri" w:hAnsi="Calibri" w:cs="Calibri"/>
+        </w:rPr>
+      </w:pPr>
+      <w:r>
+        <w:rPr>
+          <w:rFonts w:ascii="Calibri" w:hAnsi="Calibri" w:cs="Calibri"/>
+        </w:rPr>
+        <w:t xml:space="preserve">Allow customers to schedule, modify, or cancel driving lessons online. </w:t>
       </w:r>
     </w:p>
     <w:p>
@@ -528,18 +1099,16 @@
           <w:numId w:val="9"/>
         </w:numPr>
         <w:suppressAutoHyphens/>
-        <w:spacing w:after="240" w:line="240" w:lineRule="auto"/>
-        <w:rPr>
-          <w:rFonts w:ascii="Calibri" w:eastAsia="Calibri" w:hAnsi="Calibri" w:cs="Calibri"/>
-          <w:color w:val="000000"/>
-        </w:rPr>
-      </w:pPr>
-      <w:r>
-        <w:rPr>
-          <w:rFonts w:ascii="Calibri" w:eastAsia="Calibri" w:hAnsi="Calibri" w:cs="Calibri"/>
-          <w:color w:val="000000"/>
-        </w:rPr>
-        <w:t xml:space="preserve">Provide administrators with role-based account management, password reset capabilities, reporting tools, and secure access to system administration functions. </w:t>
+        <w:spacing w:after="240"/>
+        <w:rPr>
+          <w:rFonts w:ascii="Calibri" w:hAnsi="Calibri" w:cs="Calibri"/>
+        </w:rPr>
+      </w:pPr>
+      <w:r>
+        <w:rPr>
+          <w:rFonts w:ascii="Calibri" w:hAnsi="Calibri" w:cs="Calibri"/>
+        </w:rPr>
+        <w:t xml:space="preserve">Prevent scheduling conflicts by ensuring one instructor, one vehicle, and one customer are assigned to each lesson. </w:t>
       </w:r>
     </w:p>
     <w:p>
@@ -550,18 +1119,16 @@
           <w:numId w:val="9"/>
         </w:numPr>
         <w:suppressAutoHyphens/>
-        <w:spacing w:after="240" w:line="240" w:lineRule="auto"/>
-        <w:rPr>
-          <w:rFonts w:ascii="Calibri" w:eastAsia="Calibri" w:hAnsi="Calibri" w:cs="Calibri"/>
-          <w:color w:val="000000"/>
-        </w:rPr>
-      </w:pPr>
-      <w:r>
-        <w:rPr>
-          <w:rFonts w:ascii="Calibri" w:eastAsia="Calibri" w:hAnsi="Calibri" w:cs="Calibri"/>
-          <w:color w:val="000000"/>
-        </w:rPr>
-        <w:t xml:space="preserve">Keep online practice tests and learning materials current with DMV updates and notify administrators when changes occur. </w:t>
+        <w:spacing w:after="240"/>
+        <w:rPr>
+          <w:rFonts w:ascii="Calibri" w:hAnsi="Calibri" w:cs="Calibri"/>
+        </w:rPr>
+      </w:pPr>
+      <w:r>
+        <w:rPr>
+          <w:rFonts w:ascii="Calibri" w:hAnsi="Calibri" w:cs="Calibri"/>
+        </w:rPr>
+        <w:t xml:space="preserve">Maintain complete records of customer information, lesson history, instructor notes, and practice test progress. </w:t>
       </w:r>
     </w:p>
     <w:p>
@@ -572,6 +1139,100 @@
           <w:numId w:val="9"/>
         </w:numPr>
         <w:suppressAutoHyphens/>
+        <w:spacing w:after="240"/>
+        <w:rPr>
+          <w:rFonts w:ascii="Calibri" w:hAnsi="Calibri" w:cs="Calibri"/>
+        </w:rPr>
+      </w:pPr>
+      <w:r>
+        <w:rPr>
+          <w:rFonts w:ascii="Calibri" w:hAnsi="Calibri" w:cs="Calibri"/>
+        </w:rPr>
+        <w:t xml:space="preserve">Synchronize </w:t>
+      </w:r>
+      <w:proofErr w:type="spellStart"/>
+      <w:r>
+        <w:rPr>
+          <w:rFonts w:ascii="Calibri" w:hAnsi="Calibri" w:cs="Calibri"/>
+        </w:rPr>
+        <w:t>DriverPass</w:t>
+      </w:r>
+      <w:proofErr w:type="spellEnd"/>
+      <w:r>
+        <w:rPr>
+          <w:rFonts w:ascii="Calibri" w:hAnsi="Calibri" w:cs="Calibri"/>
+        </w:rPr>
+        <w:t xml:space="preserve"> practice materials with DMV updates whenever new rules or sample questions become available. </w:t>
+      </w:r>
+    </w:p>
+    <w:p>
+      <w:pPr>
+        <w:pStyle w:val="ListParagraph"/>
+        <w:numPr>
+          <w:ilvl w:val="0"/>
+          <w:numId w:val="9"/>
+        </w:numPr>
+        <w:suppressAutoHyphens/>
+        <w:spacing w:after="240"/>
+        <w:rPr>
+          <w:rFonts w:ascii="Calibri" w:hAnsi="Calibri" w:cs="Calibri"/>
+        </w:rPr>
+      </w:pPr>
+      <w:r>
+        <w:rPr>
+          <w:rFonts w:ascii="Calibri" w:hAnsi="Calibri" w:cs="Calibri"/>
+        </w:rPr>
+        <w:t xml:space="preserve">Record all reservation activity so management can identify who created, modified, or canceled appointments. </w:t>
+      </w:r>
+    </w:p>
+    <w:p>
+      <w:pPr>
+        <w:pStyle w:val="ListParagraph"/>
+        <w:numPr>
+          <w:ilvl w:val="0"/>
+          <w:numId w:val="9"/>
+        </w:numPr>
+        <w:suppressAutoHyphens/>
+        <w:spacing w:after="240"/>
+        <w:rPr>
+          <w:rFonts w:ascii="Calibri" w:hAnsi="Calibri" w:cs="Calibri"/>
+        </w:rPr>
+      </w:pPr>
+      <w:r>
+        <w:rPr>
+          <w:rFonts w:ascii="Calibri" w:hAnsi="Calibri" w:cs="Calibri"/>
+        </w:rPr>
+        <w:t xml:space="preserve"> Provide role-based permissions that allow administrators, office staff, and customers to access only the functions appropriate for their responsibilities. </w:t>
+      </w:r>
+    </w:p>
+    <w:p>
+      <w:pPr>
+        <w:pStyle w:val="ListParagraph"/>
+        <w:numPr>
+          <w:ilvl w:val="0"/>
+          <w:numId w:val="9"/>
+        </w:numPr>
+        <w:suppressAutoHyphens/>
+        <w:spacing w:after="240"/>
+        <w:rPr>
+          <w:rFonts w:ascii="Calibri" w:hAnsi="Calibri" w:cs="Calibri"/>
+        </w:rPr>
+      </w:pPr>
+      <w:r>
+        <w:rPr>
+          <w:rFonts w:ascii="Calibri" w:hAnsi="Calibri" w:cs="Calibri"/>
+        </w:rPr>
+        <w:t xml:space="preserve">Allow authorized administrators to reset passwords and disable user accounts without requiring developer assistance. </w:t>
+      </w:r>
+    </w:p>
+    <w:p>
+      <w:pPr>
+        <w:pStyle w:val="ListParagraph"/>
+        <w:numPr>
+          <w:ilvl w:val="0"/>
+          <w:numId w:val="9"/>
+        </w:numPr>
+        <w:suppressAutoHyphens/>
         <w:spacing w:after="240" w:line="240" w:lineRule="auto"/>
         <w:rPr>
           <w:rFonts w:ascii="Calibri" w:hAnsi="Calibri" w:cs="Calibri"/>
@@ -579,11 +1240,9 @@
       </w:pPr>
       <w:r>
         <w:rPr>
-          <w:rFonts w:ascii="Calibri" w:eastAsia="Calibri" w:hAnsi="Calibri" w:cs="Calibri"/>
-          <w:color w:val="000000"/>
-        </w:rPr>
-        <w:lastRenderedPageBreak/>
-        <w:t>Deliver a secure, browser-based system that can be accessed from desktop and mobile devices while protecting customer information.</w:t>
+          <w:rFonts w:ascii="Calibri" w:hAnsi="Calibri" w:cs="Calibri"/>
+        </w:rPr>
+        <w:t>Provide secure browser-based access from desktop and mobile devices while maintaining centralized data storage.</w:t>
       </w:r>
     </w:p>
     <w:p>
@@ -673,6 +1332,7 @@
         <w:pStyle w:val="Heading4"/>
       </w:pPr>
       <w:r>
+        <w:lastRenderedPageBreak/>
         <w:t>Performance R</w:t>
       </w:r>
       <w:r>
@@ -733,37 +1393,151 @@
     </w:p>
     <w:p>
       <w:pPr>
+        <w:pStyle w:val="ListParagraph"/>
         <w:numPr>
           <w:ilvl w:val="0"/>
-          <w:numId w:val="4"/>
+          <w:numId w:val="17"/>
         </w:numPr>
-        <w:pBdr>
-          <w:top w:val="nil"/>
-          <w:left w:val="nil"/>
-          <w:bottom w:val="nil"/>
-          <w:right w:val="nil"/>
-          <w:between w:val="nil"/>
-        </w:pBdr>
-        <w:suppressAutoHyphens/>
-        <w:spacing w:after="0" w:line="240" w:lineRule="auto"/>
-        <w:rPr>
-          <w:rFonts w:ascii="Calibri" w:eastAsia="Calibri" w:hAnsi="Calibri" w:cs="Calibri"/>
-          <w:color w:val="000000"/>
-        </w:rPr>
-      </w:pPr>
-      <w:r>
-        <w:rPr>
-          <w:rFonts w:ascii="Calibri" w:eastAsia="Calibri" w:hAnsi="Calibri" w:cs="Calibri"/>
-          <w:color w:val="000000"/>
-        </w:rPr>
-        <w:t>[Insert text]</w:t>
-      </w:r>
-    </w:p>
-    <w:p>
-      <w:pPr>
         <w:suppressAutoHyphens/>
         <w:spacing w:after="240" w:line="240" w:lineRule="auto"/>
         <w:rPr>
+          <w:rFonts w:ascii="Calibri" w:eastAsia="Calibri" w:hAnsi="Calibri" w:cs="Calibri"/>
+          <w:color w:val="000000"/>
+        </w:rPr>
+      </w:pPr>
+      <w:r>
+        <w:rPr>
+          <w:rFonts w:ascii="Calibri" w:eastAsia="Calibri" w:hAnsi="Calibri" w:cs="Calibri"/>
+          <w:color w:val="000000"/>
+        </w:rPr>
+        <w:t xml:space="preserve">The system </w:t>
+      </w:r>
+      <w:proofErr w:type="gramStart"/>
+      <w:r>
+        <w:rPr>
+          <w:rFonts w:ascii="Calibri" w:eastAsia="Calibri" w:hAnsi="Calibri" w:cs="Calibri"/>
+          <w:color w:val="000000"/>
+        </w:rPr>
+        <w:t>shall</w:t>
+      </w:r>
+      <w:proofErr w:type="gramEnd"/>
+      <w:r>
+        <w:rPr>
+          <w:rFonts w:ascii="Calibri" w:eastAsia="Calibri" w:hAnsi="Calibri" w:cs="Calibri"/>
+          <w:color w:val="000000"/>
+        </w:rPr>
+        <w:t xml:space="preserve"> operate as a cloud-hosted web application. </w:t>
+      </w:r>
+    </w:p>
+    <w:p>
+      <w:pPr>
+        <w:pStyle w:val="ListParagraph"/>
+        <w:numPr>
+          <w:ilvl w:val="0"/>
+          <w:numId w:val="17"/>
+        </w:numPr>
+        <w:suppressAutoHyphens/>
+        <w:spacing w:after="240" w:line="240" w:lineRule="auto"/>
+        <w:rPr>
+          <w:rFonts w:ascii="Calibri" w:eastAsia="Calibri" w:hAnsi="Calibri" w:cs="Calibri"/>
+          <w:color w:val="000000"/>
+        </w:rPr>
+      </w:pPr>
+      <w:r>
+        <w:rPr>
+          <w:rFonts w:ascii="Calibri" w:eastAsia="Calibri" w:hAnsi="Calibri" w:cs="Calibri"/>
+          <w:color w:val="000000"/>
+        </w:rPr>
+        <w:t xml:space="preserve">Users shall be able to access the system from any supported web browser using desktop or mobile devices. </w:t>
+      </w:r>
+    </w:p>
+    <w:p>
+      <w:pPr>
+        <w:pStyle w:val="ListParagraph"/>
+        <w:numPr>
+          <w:ilvl w:val="0"/>
+          <w:numId w:val="17"/>
+        </w:numPr>
+        <w:suppressAutoHyphens/>
+        <w:spacing w:after="240" w:line="240" w:lineRule="auto"/>
+        <w:rPr>
+          <w:rFonts w:ascii="Calibri" w:eastAsia="Calibri" w:hAnsi="Calibri" w:cs="Calibri"/>
+          <w:color w:val="000000"/>
+        </w:rPr>
+      </w:pPr>
+      <w:r>
+        <w:rPr>
+          <w:rFonts w:ascii="Calibri" w:eastAsia="Calibri" w:hAnsi="Calibri" w:cs="Calibri"/>
+          <w:color w:val="000000"/>
+        </w:rPr>
+        <w:t xml:space="preserve">Customer information </w:t>
+      </w:r>
+      <w:proofErr w:type="gramStart"/>
+      <w:r>
+        <w:rPr>
+          <w:rFonts w:ascii="Calibri" w:eastAsia="Calibri" w:hAnsi="Calibri" w:cs="Calibri"/>
+          <w:color w:val="000000"/>
+        </w:rPr>
+        <w:t>shall</w:t>
+      </w:r>
+      <w:proofErr w:type="gramEnd"/>
+      <w:r>
+        <w:rPr>
+          <w:rFonts w:ascii="Calibri" w:eastAsia="Calibri" w:hAnsi="Calibri" w:cs="Calibri"/>
+          <w:color w:val="000000"/>
+        </w:rPr>
+        <w:t xml:space="preserve"> remain centrally stored to prevent duplicate records. </w:t>
+      </w:r>
+    </w:p>
+    <w:p>
+      <w:pPr>
+        <w:pStyle w:val="ListParagraph"/>
+        <w:numPr>
+          <w:ilvl w:val="0"/>
+          <w:numId w:val="17"/>
+        </w:numPr>
+        <w:suppressAutoHyphens/>
+        <w:spacing w:after="240" w:line="240" w:lineRule="auto"/>
+        <w:rPr>
+          <w:rFonts w:ascii="Calibri" w:eastAsia="Calibri" w:hAnsi="Calibri" w:cs="Calibri"/>
+          <w:color w:val="000000"/>
+        </w:rPr>
+      </w:pPr>
+      <w:r>
+        <w:rPr>
+          <w:rFonts w:ascii="Calibri" w:eastAsia="Calibri" w:hAnsi="Calibri" w:cs="Calibri"/>
+          <w:color w:val="000000"/>
+        </w:rPr>
+        <w:t xml:space="preserve">Reports shall be available for download to support offline viewing and analysis. </w:t>
+      </w:r>
+    </w:p>
+    <w:p>
+      <w:pPr>
+        <w:pStyle w:val="ListParagraph"/>
+        <w:numPr>
+          <w:ilvl w:val="0"/>
+          <w:numId w:val="17"/>
+        </w:numPr>
+        <w:suppressAutoHyphens/>
+        <w:spacing w:after="240" w:line="240" w:lineRule="auto"/>
+        <w:rPr>
+          <w:rFonts w:ascii="Calibri" w:eastAsia="Calibri" w:hAnsi="Calibri" w:cs="Calibri"/>
+          <w:color w:val="000000"/>
+        </w:rPr>
+      </w:pPr>
+      <w:r>
+        <w:rPr>
+          <w:rFonts w:ascii="Calibri" w:eastAsia="Calibri" w:hAnsi="Calibri" w:cs="Calibri"/>
+          <w:color w:val="000000"/>
+        </w:rPr>
+        <w:t xml:space="preserve">DMV content shall remain synchronized whenever updates become available. </w:t>
+      </w:r>
+    </w:p>
+    <w:p>
+      <w:pPr>
+        <w:suppressAutoHyphens/>
+        <w:spacing w:after="240" w:line="240" w:lineRule="auto"/>
+        <w:rPr>
           <w:rFonts w:ascii="Calibri" w:hAnsi="Calibri" w:cs="Calibri"/>
         </w:rPr>
       </w:pPr>
@@ -857,6 +1631,475 @@
           <w:i/>
         </w:rPr>
         <w:t>?</w:t>
+      </w:r>
+    </w:p>
+    <w:p>
+      <w:pPr>
+        <w:pStyle w:val="ListParagraph"/>
+        <w:numPr>
+          <w:ilvl w:val="0"/>
+          <w:numId w:val="16"/>
+        </w:numPr>
+        <w:suppressAutoHyphens/>
+        <w:spacing w:after="360" w:line="240" w:lineRule="auto"/>
+        <w:rPr>
+          <w:rFonts w:ascii="Calibri" w:eastAsia="Calibri" w:hAnsi="Calibri" w:cs="Calibri"/>
+          <w:color w:val="000000"/>
+        </w:rPr>
+      </w:pPr>
+      <w:r>
+        <w:rPr>
+          <w:rFonts w:ascii="Calibri" w:eastAsia="Calibri" w:hAnsi="Calibri" w:cs="Calibri"/>
+          <w:color w:val="000000"/>
+        </w:rPr>
+        <w:t>The application shall be browser-based and hosted in the cloud.</w:t>
+      </w:r>
+    </w:p>
+    <w:p>
+      <w:pPr>
+        <w:pStyle w:val="ListParagraph"/>
+        <w:numPr>
+          <w:ilvl w:val="0"/>
+          <w:numId w:val="16"/>
+        </w:numPr>
+        <w:suppressAutoHyphens/>
+        <w:spacing w:after="360" w:line="240" w:lineRule="auto"/>
+        <w:rPr>
+          <w:rFonts w:ascii="Calibri" w:eastAsia="Calibri" w:hAnsi="Calibri" w:cs="Calibri"/>
+          <w:color w:val="000000"/>
+        </w:rPr>
+      </w:pPr>
+      <w:r>
+        <w:rPr>
+          <w:rFonts w:ascii="Calibri" w:eastAsia="Calibri" w:hAnsi="Calibri" w:cs="Calibri"/>
+          <w:color w:val="000000"/>
+        </w:rPr>
+        <w:t xml:space="preserve">The system </w:t>
+      </w:r>
+      <w:proofErr w:type="gramStart"/>
+      <w:r>
+        <w:rPr>
+          <w:rFonts w:ascii="Calibri" w:eastAsia="Calibri" w:hAnsi="Calibri" w:cs="Calibri"/>
+          <w:color w:val="000000"/>
+        </w:rPr>
+        <w:t>shall</w:t>
+      </w:r>
+      <w:proofErr w:type="gramEnd"/>
+      <w:r>
+        <w:rPr>
+          <w:rFonts w:ascii="Calibri" w:eastAsia="Calibri" w:hAnsi="Calibri" w:cs="Calibri"/>
+          <w:color w:val="000000"/>
+        </w:rPr>
+        <w:t xml:space="preserve"> support modern desktop and mobile web browsers.</w:t>
+      </w:r>
+    </w:p>
+    <w:p>
+      <w:pPr>
+        <w:pStyle w:val="ListParagraph"/>
+        <w:numPr>
+          <w:ilvl w:val="0"/>
+          <w:numId w:val="16"/>
+        </w:numPr>
+        <w:suppressAutoHyphens/>
+        <w:spacing w:after="360" w:line="240" w:lineRule="auto"/>
+        <w:rPr>
+          <w:rFonts w:ascii="Calibri" w:eastAsia="Calibri" w:hAnsi="Calibri" w:cs="Calibri"/>
+          <w:color w:val="000000"/>
+        </w:rPr>
+      </w:pPr>
+      <w:r>
+        <w:rPr>
+          <w:rFonts w:ascii="Calibri" w:eastAsia="Calibri" w:hAnsi="Calibri" w:cs="Calibri"/>
+          <w:color w:val="000000"/>
+        </w:rPr>
+        <w:t xml:space="preserve">The application shall use a centralized database to store </w:t>
+      </w:r>
+      <w:proofErr w:type="gramStart"/>
+      <w:r>
+        <w:rPr>
+          <w:rFonts w:ascii="Calibri" w:eastAsia="Calibri" w:hAnsi="Calibri" w:cs="Calibri"/>
+          <w:color w:val="000000"/>
+        </w:rPr>
+        <w:t>customer</w:t>
+      </w:r>
+      <w:proofErr w:type="gramEnd"/>
+      <w:r>
+        <w:rPr>
+          <w:rFonts w:ascii="Calibri" w:eastAsia="Calibri" w:hAnsi="Calibri" w:cs="Calibri"/>
+          <w:color w:val="000000"/>
+        </w:rPr>
+        <w:t>, scheduling, lesson, and reporting information.</w:t>
+      </w:r>
+    </w:p>
+    <w:p>
+      <w:pPr>
+        <w:pStyle w:val="ListParagraph"/>
+        <w:numPr>
+          <w:ilvl w:val="0"/>
+          <w:numId w:val="16"/>
+        </w:numPr>
+        <w:suppressAutoHyphens/>
+        <w:spacing w:after="360" w:line="240" w:lineRule="auto"/>
+        <w:rPr>
+          <w:rFonts w:ascii="Calibri" w:hAnsi="Calibri" w:cs="Calibri"/>
+        </w:rPr>
+      </w:pPr>
+      <w:r>
+        <w:rPr>
+          <w:rFonts w:ascii="Calibri" w:eastAsia="Calibri" w:hAnsi="Calibri" w:cs="Calibri"/>
+          <w:color w:val="000000"/>
+        </w:rPr>
+        <w:t>The system shall maintain connectivity with DMV information sources to receive updates.</w:t>
+      </w:r>
+    </w:p>
+    <w:p>
+      <w:pPr>
+        <w:pStyle w:val="Heading4"/>
+      </w:pPr>
+      <w:r>
+        <w:t>Accuracy and Precision</w:t>
+      </w:r>
+    </w:p>
+    <w:p>
+      <w:pPr>
+        <w:suppressAutoHyphens/>
+        <w:spacing w:after="0" w:line="240" w:lineRule="auto"/>
+        <w:rPr>
+          <w:rFonts w:ascii="Calibri" w:hAnsi="Calibri" w:cs="Calibri"/>
+          <w:strike/>
+        </w:rPr>
+      </w:pPr>
+      <w:r>
+        <w:rPr>
+          <w:rFonts w:ascii="Calibri" w:hAnsi="Calibri" w:cs="Calibri"/>
+          <w:i/>
+        </w:rPr>
+        <w:t>How will you distinguish between different users?</w:t>
+      </w:r>
+      <w:r>
+        <w:rPr>
+          <w:rFonts w:ascii="Calibri" w:hAnsi="Calibri" w:cs="Calibri"/>
+        </w:rPr>
+        <w:t xml:space="preserve"> </w:t>
+      </w:r>
+      <w:r>
+        <w:rPr>
+          <w:rFonts w:ascii="Calibri" w:hAnsi="Calibri" w:cs="Calibri"/>
+          <w:i/>
+        </w:rPr>
+        <w:t>Is the input case-</w:t>
+      </w:r>
+      <w:r>
+        <w:rPr>
+          <w:rFonts w:ascii="Calibri" w:hAnsi="Calibri" w:cs="Calibri"/>
+          <w:i/>
+        </w:rPr>
+        <w:t>sensitive? When should the system inform the admin of a problem?</w:t>
+      </w:r>
+    </w:p>
+    <w:p>
+      <w:pPr>
+        <w:pStyle w:val="ListParagraph"/>
+        <w:numPr>
+          <w:ilvl w:val="0"/>
+          <w:numId w:val="18"/>
+        </w:numPr>
+        <w:suppressAutoHyphens/>
+        <w:spacing w:after="360" w:line="240" w:lineRule="auto"/>
+        <w:rPr>
+          <w:rFonts w:ascii="Calibri" w:eastAsia="Calibri" w:hAnsi="Calibri" w:cs="Calibri"/>
+          <w:color w:val="000000"/>
+        </w:rPr>
+      </w:pPr>
+      <w:r>
+        <w:rPr>
+          <w:rFonts w:ascii="Calibri" w:eastAsia="Calibri" w:hAnsi="Calibri" w:cs="Calibri"/>
+          <w:color w:val="000000"/>
+        </w:rPr>
+        <w:t>The system shall distinguish between customers, secretaries, administrators, instructors, management, and IT personnel through role-based permissions.</w:t>
+      </w:r>
+    </w:p>
+    <w:p>
+      <w:pPr>
+        <w:pStyle w:val="ListParagraph"/>
+        <w:numPr>
+          <w:ilvl w:val="0"/>
+          <w:numId w:val="18"/>
+        </w:numPr>
+        <w:suppressAutoHyphens/>
+        <w:spacing w:after="360" w:line="240" w:lineRule="auto"/>
+        <w:rPr>
+          <w:rFonts w:ascii="Calibri" w:eastAsia="Calibri" w:hAnsi="Calibri" w:cs="Calibri"/>
+          <w:color w:val="000000"/>
+        </w:rPr>
+      </w:pPr>
+      <w:r>
+        <w:rPr>
+          <w:rFonts w:ascii="Calibri" w:eastAsia="Calibri" w:hAnsi="Calibri" w:cs="Calibri"/>
+          <w:color w:val="000000"/>
+        </w:rPr>
+        <w:t>Appointment assignments shall accurately associate customers with instructors, vehicles, dates, and lesson times.</w:t>
+      </w:r>
+    </w:p>
+    <w:p>
+      <w:pPr>
+        <w:pStyle w:val="ListParagraph"/>
+        <w:numPr>
+          <w:ilvl w:val="0"/>
+          <w:numId w:val="18"/>
+        </w:numPr>
+        <w:suppressAutoHyphens/>
+        <w:spacing w:after="360" w:line="240" w:lineRule="auto"/>
+        <w:rPr>
+          <w:rFonts w:ascii="Calibri" w:eastAsia="Calibri" w:hAnsi="Calibri" w:cs="Calibri"/>
+          <w:color w:val="000000"/>
+        </w:rPr>
+      </w:pPr>
+      <w:r>
+        <w:rPr>
+          <w:rFonts w:ascii="Calibri" w:eastAsia="Calibri" w:hAnsi="Calibri" w:cs="Calibri"/>
+          <w:color w:val="000000"/>
+        </w:rPr>
+        <w:t>Practice test records shall accurately display completion status, score, and time taken.</w:t>
+      </w:r>
+    </w:p>
+    <w:p>
+      <w:pPr>
+        <w:pStyle w:val="ListParagraph"/>
+        <w:numPr>
+          <w:ilvl w:val="0"/>
+          <w:numId w:val="18"/>
+        </w:numPr>
+        <w:suppressAutoHyphens/>
+        <w:spacing w:after="360" w:line="240" w:lineRule="auto"/>
+        <w:rPr>
+          <w:rFonts w:ascii="Calibri" w:eastAsia="Calibri" w:hAnsi="Calibri" w:cs="Calibri"/>
+          <w:color w:val="000000"/>
+        </w:rPr>
+      </w:pPr>
+      <w:r>
+        <w:rPr>
+          <w:rFonts w:ascii="Calibri" w:eastAsia="Calibri" w:hAnsi="Calibri" w:cs="Calibri"/>
+          <w:color w:val="000000"/>
+        </w:rPr>
+        <w:t xml:space="preserve">The system shall maintain an audit </w:t>
+      </w:r>
+      <w:proofErr w:type="gramStart"/>
+      <w:r>
+        <w:rPr>
+          <w:rFonts w:ascii="Calibri" w:eastAsia="Calibri" w:hAnsi="Calibri" w:cs="Calibri"/>
+          <w:color w:val="000000"/>
+        </w:rPr>
+        <w:t>trail</w:t>
+      </w:r>
+      <w:proofErr w:type="gramEnd"/>
+      <w:r>
+        <w:rPr>
+          <w:rFonts w:ascii="Calibri" w:eastAsia="Calibri" w:hAnsi="Calibri" w:cs="Calibri"/>
+          <w:color w:val="000000"/>
+        </w:rPr>
+        <w:t xml:space="preserve"> identifying the user responsible for creating, modifying, or canceling reservations.</w:t>
+      </w:r>
+    </w:p>
+    <w:p>
+      <w:pPr>
+        <w:pStyle w:val="ListParagraph"/>
+        <w:numPr>
+          <w:ilvl w:val="0"/>
+          <w:numId w:val="18"/>
+        </w:numPr>
+        <w:suppressAutoHyphens/>
+        <w:spacing w:after="360" w:line="240" w:lineRule="auto"/>
+        <w:rPr>
+          <w:rFonts w:ascii="Calibri" w:hAnsi="Calibri" w:cs="Calibri"/>
+        </w:rPr>
+      </w:pPr>
+      <w:r>
+        <w:rPr>
+          <w:rFonts w:ascii="Calibri" w:eastAsia="Calibri" w:hAnsi="Calibri" w:cs="Calibri"/>
+          <w:color w:val="000000"/>
+        </w:rPr>
+        <w:t>Administrators shall be notified whenever DMV content has been updated.</w:t>
+      </w:r>
+    </w:p>
+    <w:p>
+      <w:pPr>
+        <w:pStyle w:val="Heading4"/>
+      </w:pPr>
+      <w:r>
+        <w:t xml:space="preserve">Adaptability </w:t>
+      </w:r>
+    </w:p>
+    <w:p>
+      <w:pPr>
+        <w:suppressAutoHyphens/>
+        <w:spacing w:after="0" w:line="240" w:lineRule="auto"/>
+        <w:rPr>
+          <w:rFonts w:ascii="Calibri" w:hAnsi="Calibri" w:cs="Calibri"/>
+          <w:i/>
+          <w:strike/>
+        </w:rPr>
+      </w:pPr>
+      <w:r>
+        <w:rPr>
+          <w:rFonts w:ascii="Calibri" w:hAnsi="Calibri" w:cs="Calibri"/>
+          <w:i/>
+        </w:rPr>
+        <w:t xml:space="preserve">Can </w:t>
+      </w:r>
+      <w:r>
+        <w:rPr>
+          <w:rFonts w:ascii="Calibri" w:hAnsi="Calibri" w:cs="Calibri"/>
+          <w:i/>
+        </w:rPr>
+        <w:t>you</w:t>
+      </w:r>
+      <w:r>
+        <w:rPr>
+          <w:rFonts w:ascii="Calibri" w:hAnsi="Calibri" w:cs="Calibri"/>
+          <w:i/>
+        </w:rPr>
+        <w:t xml:space="preserve"> make changes to the user (add/remove/modify) without changing code? How will the system adapt to platform updates? What type of access does the IT admin need? </w:t>
+      </w:r>
+    </w:p>
+    <w:p>
+      <w:pPr>
+        <w:pStyle w:val="ListParagraph"/>
+        <w:numPr>
+          <w:ilvl w:val="0"/>
+          <w:numId w:val="19"/>
+        </w:numPr>
+        <w:suppressAutoHyphens/>
+        <w:spacing w:after="360" w:line="240" w:lineRule="auto"/>
+        <w:rPr>
+          <w:rFonts w:ascii="Calibri" w:eastAsia="Calibri" w:hAnsi="Calibri" w:cs="Calibri"/>
+          <w:color w:val="000000"/>
+        </w:rPr>
+      </w:pPr>
+      <w:r>
+        <w:rPr>
+          <w:rFonts w:ascii="Calibri" w:eastAsia="Calibri" w:hAnsi="Calibri" w:cs="Calibri"/>
+          <w:color w:val="000000"/>
+        </w:rPr>
+        <w:t>Administrators shall be able to disable existing training packages without modifying application code.</w:t>
+      </w:r>
+    </w:p>
+    <w:p>
+      <w:pPr>
+        <w:pStyle w:val="ListParagraph"/>
+        <w:numPr>
+          <w:ilvl w:val="0"/>
+          <w:numId w:val="19"/>
+        </w:numPr>
+        <w:suppressAutoHyphens/>
+        <w:spacing w:after="360" w:line="240" w:lineRule="auto"/>
+        <w:rPr>
+          <w:rFonts w:ascii="Calibri" w:eastAsia="Calibri" w:hAnsi="Calibri" w:cs="Calibri"/>
+          <w:color w:val="000000"/>
+        </w:rPr>
+      </w:pPr>
+      <w:r>
+        <w:rPr>
+          <w:rFonts w:ascii="Calibri" w:eastAsia="Calibri" w:hAnsi="Calibri" w:cs="Calibri"/>
+          <w:color w:val="000000"/>
+        </w:rPr>
+        <w:t>IT administrators shall manage user accounts, passwords, and account permissions through administrative tools.</w:t>
+      </w:r>
+    </w:p>
+    <w:p>
+      <w:pPr>
+        <w:pStyle w:val="ListParagraph"/>
+        <w:numPr>
+          <w:ilvl w:val="0"/>
+          <w:numId w:val="19"/>
+        </w:numPr>
+        <w:suppressAutoHyphens/>
+        <w:spacing w:after="360" w:line="240" w:lineRule="auto"/>
+        <w:rPr>
+          <w:rFonts w:ascii="Calibri" w:eastAsia="Calibri" w:hAnsi="Calibri" w:cs="Calibri"/>
+          <w:color w:val="000000"/>
+        </w:rPr>
+      </w:pPr>
+      <w:r>
+        <w:rPr>
+          <w:rFonts w:ascii="Calibri" w:eastAsia="Calibri" w:hAnsi="Calibri" w:cs="Calibri"/>
+          <w:color w:val="000000"/>
+        </w:rPr>
+        <w:t>The system shall support future package additions and expanded learning content with minimal changes to the existing system architecture.</w:t>
+      </w:r>
+    </w:p>
+    <w:p>
+      <w:pPr>
+        <w:pStyle w:val="ListParagraph"/>
+        <w:numPr>
+          <w:ilvl w:val="0"/>
+          <w:numId w:val="19"/>
+        </w:numPr>
+        <w:suppressAutoHyphens/>
+        <w:spacing w:after="360" w:line="240" w:lineRule="auto"/>
+        <w:rPr>
+          <w:rFonts w:ascii="Calibri" w:hAnsi="Calibri" w:cs="Calibri"/>
+        </w:rPr>
+      </w:pPr>
+      <w:r>
+        <w:rPr>
+          <w:rFonts w:ascii="Calibri" w:eastAsia="Calibri" w:hAnsi="Calibri" w:cs="Calibri"/>
+          <w:color w:val="000000"/>
+        </w:rPr>
+        <w:t xml:space="preserve">Cloud </w:t>
+      </w:r>
+      <w:proofErr w:type="gramStart"/>
+      <w:r>
+        <w:rPr>
+          <w:rFonts w:ascii="Calibri" w:eastAsia="Calibri" w:hAnsi="Calibri" w:cs="Calibri"/>
+          <w:color w:val="000000"/>
+        </w:rPr>
+        <w:t>hosting shall</w:t>
+      </w:r>
+      <w:proofErr w:type="gramEnd"/>
+      <w:r>
+        <w:rPr>
+          <w:rFonts w:ascii="Calibri" w:eastAsia="Calibri" w:hAnsi="Calibri" w:cs="Calibri"/>
+          <w:color w:val="000000"/>
+        </w:rPr>
+        <w:t xml:space="preserve"> allow routine platform updates without disrupting normal business operations.</w:t>
+      </w:r>
+    </w:p>
+    <w:p>
+      <w:pPr>
+        <w:pStyle w:val="ListParagraph"/>
+        <w:suppressAutoHyphens/>
+        <w:spacing w:after="360" w:line="240" w:lineRule="auto"/>
+        <w:rPr>
+          <w:rFonts w:ascii="Calibri" w:hAnsi="Calibri" w:cs="Calibri"/>
+        </w:rPr>
+      </w:pPr>
+    </w:p>
+    <w:p>
+      <w:pPr>
+        <w:pStyle w:val="Heading4"/>
+      </w:pPr>
+      <w:r>
+        <w:lastRenderedPageBreak/>
+        <w:t>Security</w:t>
+      </w:r>
+    </w:p>
+    <w:p>
+      <w:pPr>
+        <w:suppressAutoHyphens/>
+        <w:spacing w:after="0" w:line="240" w:lineRule="auto"/>
+        <w:rPr>
+          <w:rFonts w:ascii="Calibri" w:hAnsi="Calibri" w:cs="Calibri"/>
+          <w:i/>
+          <w:strike/>
+        </w:rPr>
+      </w:pPr>
+      <w:r>
+        <w:rPr>
+          <w:rFonts w:ascii="Calibri" w:hAnsi="Calibri" w:cs="Calibri"/>
+          <w:i/>
+        </w:rPr>
+        <w:t xml:space="preserve">What is required for the user to log in? How can you secure the connection or the data exchange between the client and the server? What should happen to the account if there is a “brute force” hacking attempt? What happens if the user forgets their password? </w:t>
       </w:r>
     </w:p>
     <w:p>
@@ -884,61 +2127,7 @@
           <w:rFonts w:ascii="Calibri" w:eastAsia="Calibri" w:hAnsi="Calibri" w:cs="Calibri"/>
           <w:color w:val="000000"/>
         </w:rPr>
-        <w:t>[Insert text]</w:t>
-      </w:r>
-    </w:p>
-    <w:p>
-      <w:pPr>
-        <w:suppressAutoHyphens/>
-        <w:spacing w:after="360" w:line="240" w:lineRule="auto"/>
-        <w:rPr>
-          <w:rFonts w:ascii="Calibri" w:hAnsi="Calibri" w:cs="Calibri"/>
-        </w:rPr>
-      </w:pPr>
-    </w:p>
-    <w:p>
-      <w:pPr>
-        <w:pStyle w:val="Heading4"/>
-      </w:pPr>
-      <w:r>
-        <w:t>Accuracy and Precision</w:t>
-      </w:r>
-    </w:p>
-    <w:p>
-      <w:pPr>
-        <w:suppressAutoHyphens/>
-        <w:spacing w:after="0" w:line="240" w:lineRule="auto"/>
-        <w:rPr>
-          <w:rFonts w:ascii="Calibri" w:hAnsi="Calibri" w:cs="Calibri"/>
-          <w:strike/>
-        </w:rPr>
-      </w:pPr>
-      <w:r>
-        <w:rPr>
-          <w:rFonts w:ascii="Calibri" w:hAnsi="Calibri" w:cs="Calibri"/>
-          <w:i/>
-        </w:rPr>
-        <w:t>How will you distinguish between different users?</w:t>
-      </w:r>
-      <w:r>
-        <w:rPr>
-          <w:rFonts w:ascii="Calibri" w:hAnsi="Calibri" w:cs="Calibri"/>
-        </w:rPr>
-        <w:t xml:space="preserve"> </w:t>
-      </w:r>
-      <w:r>
-        <w:rPr>
-          <w:rFonts w:ascii="Calibri" w:hAnsi="Calibri" w:cs="Calibri"/>
-          <w:i/>
-        </w:rPr>
-        <w:t>Is the input case-</w:t>
-      </w:r>
-      <w:r>
-        <w:rPr>
-          <w:rFonts w:ascii="Calibri" w:hAnsi="Calibri" w:cs="Calibri"/>
-          <w:i/>
-        </w:rPr>
-        <w:t>sensitive? When should the system inform the admin of a problem?</w:t>
+        <w:t>Users shall authenticate with individual accounts before accessing protected features.</w:t>
       </w:r>
     </w:p>
     <w:p>
@@ -966,56 +2155,23 @@
           <w:rFonts w:ascii="Calibri" w:eastAsia="Calibri" w:hAnsi="Calibri" w:cs="Calibri"/>
           <w:color w:val="000000"/>
         </w:rPr>
-        <w:t>[Insert text]</w:t>
-      </w:r>
-    </w:p>
-    <w:p>
-      <w:pPr>
-        <w:suppressAutoHyphens/>
-        <w:spacing w:after="360" w:line="240" w:lineRule="auto"/>
-        <w:rPr>
-          <w:rFonts w:ascii="Calibri" w:hAnsi="Calibri" w:cs="Calibri"/>
-        </w:rPr>
-      </w:pPr>
-    </w:p>
-    <w:p>
-      <w:pPr>
-        <w:pStyle w:val="Heading4"/>
-      </w:pPr>
-      <w:r>
-        <w:t xml:space="preserve">Adaptability </w:t>
-      </w:r>
-    </w:p>
-    <w:p>
-      <w:pPr>
-        <w:suppressAutoHyphens/>
-        <w:spacing w:after="0" w:line="240" w:lineRule="auto"/>
-        <w:rPr>
-          <w:rFonts w:ascii="Calibri" w:hAnsi="Calibri" w:cs="Calibri"/>
-          <w:i/>
-          <w:strike/>
-        </w:rPr>
-      </w:pPr>
-      <w:r>
-        <w:rPr>
-          <w:rFonts w:ascii="Calibri" w:hAnsi="Calibri" w:cs="Calibri"/>
-          <w:i/>
-        </w:rPr>
-        <w:t xml:space="preserve">Can </w:t>
-      </w:r>
-      <w:r>
-        <w:rPr>
-          <w:rFonts w:ascii="Calibri" w:hAnsi="Calibri" w:cs="Calibri"/>
-          <w:i/>
-        </w:rPr>
-        <w:t>you</w:t>
-      </w:r>
-      <w:r>
-        <w:rPr>
-          <w:rFonts w:ascii="Calibri" w:hAnsi="Calibri" w:cs="Calibri"/>
-          <w:i/>
-        </w:rPr>
-        <w:t xml:space="preserve"> make changes to the user (add/remove/modify) without changing code? How will the system adapt to platform updates? What type of access does the IT admin need? </w:t>
+        <w:t xml:space="preserve">Password reset functionality </w:t>
+      </w:r>
+      <w:proofErr w:type="gramStart"/>
+      <w:r>
+        <w:rPr>
+          <w:rFonts w:ascii="Calibri" w:eastAsia="Calibri" w:hAnsi="Calibri" w:cs="Calibri"/>
+          <w:color w:val="000000"/>
+        </w:rPr>
+        <w:t>shall</w:t>
+      </w:r>
+      <w:proofErr w:type="gramEnd"/>
+      <w:r>
+        <w:rPr>
+          <w:rFonts w:ascii="Calibri" w:eastAsia="Calibri" w:hAnsi="Calibri" w:cs="Calibri"/>
+          <w:color w:val="000000"/>
+        </w:rPr>
+        <w:t xml:space="preserve"> be available for customers who forget their passwords.</w:t>
       </w:r>
     </w:p>
     <w:p>
@@ -1043,42 +2199,7 @@
           <w:rFonts w:ascii="Calibri" w:eastAsia="Calibri" w:hAnsi="Calibri" w:cs="Calibri"/>
           <w:color w:val="000000"/>
         </w:rPr>
-        <w:t>[Insert text]</w:t>
-      </w:r>
-    </w:p>
-    <w:p>
-      <w:pPr>
-        <w:suppressAutoHyphens/>
-        <w:spacing w:after="360" w:line="240" w:lineRule="auto"/>
-        <w:rPr>
-          <w:rFonts w:ascii="Calibri" w:hAnsi="Calibri" w:cs="Calibri"/>
-        </w:rPr>
-      </w:pPr>
-    </w:p>
-    <w:p>
-      <w:pPr>
-        <w:pStyle w:val="Heading4"/>
-      </w:pPr>
-      <w:r>
-        <w:t>Security</w:t>
-      </w:r>
-    </w:p>
-    <w:p>
-      <w:pPr>
-        <w:suppressAutoHyphens/>
-        <w:spacing w:after="0" w:line="240" w:lineRule="auto"/>
-        <w:rPr>
-          <w:rFonts w:ascii="Calibri" w:hAnsi="Calibri" w:cs="Calibri"/>
-          <w:i/>
-          <w:strike/>
-        </w:rPr>
-      </w:pPr>
-      <w:r>
-        <w:rPr>
-          <w:rFonts w:ascii="Calibri" w:hAnsi="Calibri" w:cs="Calibri"/>
-          <w:i/>
-        </w:rPr>
-        <w:t xml:space="preserve">What is required for the user to log in? How can you secure the connection or the data exchange between the client and the server? What should happen to the account if there is a “brute force” hacking attempt? What happens if the user forgets their password? </w:t>
+        <w:t>Role-based permissions shall restrict users to authorized system functions.</w:t>
       </w:r>
     </w:p>
     <w:p>
@@ -1106,72 +2227,7 @@
           <w:rFonts w:ascii="Calibri" w:eastAsia="Calibri" w:hAnsi="Calibri" w:cs="Calibri"/>
           <w:color w:val="000000"/>
         </w:rPr>
-        <w:t>[Insert text]</w:t>
-      </w:r>
-    </w:p>
-    <w:p>
-      <w:pPr>
-        <w:suppressAutoHyphens/>
-        <w:spacing w:after="360" w:line="240" w:lineRule="auto"/>
-        <w:rPr>
-          <w:rFonts w:ascii="Calibri" w:hAnsi="Calibri" w:cs="Calibri"/>
-        </w:rPr>
-      </w:pPr>
-    </w:p>
-    <w:p>
-      <w:pPr>
-        <w:pStyle w:val="Heading3"/>
-        <w:keepNext w:val="0"/>
-        <w:keepLines w:val="0"/>
-        <w:suppressAutoHyphens/>
-      </w:pPr>
-      <w:r>
-        <w:t>Functional Requirements</w:t>
-      </w:r>
-    </w:p>
-    <w:p>
-      <w:pPr>
-        <w:suppressAutoHyphens/>
-        <w:spacing w:after="0" w:line="240" w:lineRule="auto"/>
-        <w:rPr>
-          <w:rFonts w:ascii="Calibri" w:hAnsi="Calibri" w:cs="Calibri"/>
-          <w:i/>
-        </w:rPr>
-      </w:pPr>
-      <w:r>
-        <w:rPr>
-          <w:rFonts w:ascii="Calibri" w:hAnsi="Calibri" w:cs="Calibri"/>
-          <w:i/>
-        </w:rPr>
-        <w:t>Using the information from the scenario, think about the different functions the system needs to provide. Each of your bullets should start with “The system shall</w:t>
-      </w:r>
-      <w:r>
-        <w:rPr>
-          <w:rFonts w:ascii="Calibri" w:hAnsi="Calibri" w:cs="Calibri"/>
-          <w:i/>
-        </w:rPr>
-        <w:t xml:space="preserve"> . . .”</w:t>
-      </w:r>
-      <w:r>
-        <w:rPr>
-          <w:rFonts w:ascii="Calibri" w:hAnsi="Calibri" w:cs="Calibri"/>
-          <w:i/>
-        </w:rPr>
-        <w:t xml:space="preserve"> For example, one </w:t>
-      </w:r>
-      <w:r>
-        <w:rPr>
-          <w:rFonts w:ascii="Calibri" w:hAnsi="Calibri" w:cs="Calibri"/>
-          <w:i/>
-        </w:rPr>
-        <w:t>functional requirement might be,</w:t>
-      </w:r>
-      <w:r>
-        <w:rPr>
-          <w:rFonts w:ascii="Calibri" w:hAnsi="Calibri" w:cs="Calibri"/>
-          <w:i/>
-        </w:rPr>
-        <w:t xml:space="preserve"> “The system shall validate user credentials when logging in.”</w:t>
+        <w:t>Administrative accounts shall have additional privileges for user management and system maintenance.</w:t>
       </w:r>
     </w:p>
     <w:p>
@@ -1199,7 +2255,143 @@
           <w:rFonts w:ascii="Calibri" w:eastAsia="Calibri" w:hAnsi="Calibri" w:cs="Calibri"/>
           <w:color w:val="000000"/>
         </w:rPr>
-        <w:lastRenderedPageBreak/>
+        <w:t xml:space="preserve">Customer information </w:t>
+      </w:r>
+      <w:proofErr w:type="gramStart"/>
+      <w:r>
+        <w:rPr>
+          <w:rFonts w:ascii="Calibri" w:eastAsia="Calibri" w:hAnsi="Calibri" w:cs="Calibri"/>
+          <w:color w:val="000000"/>
+        </w:rPr>
+        <w:t>shall</w:t>
+      </w:r>
+      <w:proofErr w:type="gramEnd"/>
+      <w:r>
+        <w:rPr>
+          <w:rFonts w:ascii="Calibri" w:eastAsia="Calibri" w:hAnsi="Calibri" w:cs="Calibri"/>
+          <w:color w:val="000000"/>
+        </w:rPr>
+        <w:t xml:space="preserve"> be securely stored and transmitted between the client and server.</w:t>
+      </w:r>
+    </w:p>
+    <w:p>
+      <w:pPr>
+        <w:numPr>
+          <w:ilvl w:val="0"/>
+          <w:numId w:val="2"/>
+        </w:numPr>
+        <w:pBdr>
+          <w:top w:val="nil"/>
+          <w:left w:val="nil"/>
+          <w:bottom w:val="nil"/>
+          <w:right w:val="nil"/>
+          <w:between w:val="nil"/>
+        </w:pBdr>
+        <w:suppressAutoHyphens/>
+        <w:spacing w:after="0" w:line="240" w:lineRule="auto"/>
+        <w:rPr>
+          <w:rFonts w:ascii="Calibri" w:eastAsia="Calibri" w:hAnsi="Calibri" w:cs="Calibri"/>
+          <w:color w:val="000000"/>
+        </w:rPr>
+      </w:pPr>
+      <w:r>
+        <w:rPr>
+          <w:rFonts w:ascii="Calibri" w:eastAsia="Calibri" w:hAnsi="Calibri" w:cs="Calibri"/>
+          <w:color w:val="000000"/>
+        </w:rPr>
+        <w:t>System activity shall be logged to provide accountability for important changes.</w:t>
+      </w:r>
+    </w:p>
+    <w:p>
+      <w:pPr>
+        <w:suppressAutoHyphens/>
+        <w:spacing w:after="360" w:line="240" w:lineRule="auto"/>
+        <w:rPr>
+          <w:rFonts w:ascii="Calibri" w:hAnsi="Calibri" w:cs="Calibri"/>
+        </w:rPr>
+      </w:pPr>
+    </w:p>
+    <w:p>
+      <w:pPr>
+        <w:pStyle w:val="Heading3"/>
+        <w:keepNext w:val="0"/>
+        <w:keepLines w:val="0"/>
+        <w:suppressAutoHyphens/>
+      </w:pPr>
+      <w:r>
+        <w:t>Functional Requirements</w:t>
+      </w:r>
+    </w:p>
+    <w:p>
+      <w:pPr>
+        <w:suppressAutoHyphens/>
+        <w:spacing w:after="0" w:line="240" w:lineRule="auto"/>
+        <w:rPr>
+          <w:rFonts w:ascii="Calibri" w:hAnsi="Calibri" w:cs="Calibri"/>
+          <w:i/>
+        </w:rPr>
+      </w:pPr>
+      <w:r>
+        <w:rPr>
+          <w:rFonts w:ascii="Calibri" w:hAnsi="Calibri" w:cs="Calibri"/>
+          <w:i/>
+        </w:rPr>
+        <w:t>Using the information from the scenario, think about the different functions the system needs to provide. Each of your bullets should start with “The system shall</w:t>
+      </w:r>
+      <w:r>
+        <w:rPr>
+          <w:rFonts w:ascii="Calibri" w:hAnsi="Calibri" w:cs="Calibri"/>
+          <w:i/>
+        </w:rPr>
+        <w:t xml:space="preserve"> . . .”</w:t>
+      </w:r>
+      <w:r>
+        <w:rPr>
+          <w:rFonts w:ascii="Calibri" w:hAnsi="Calibri" w:cs="Calibri"/>
+          <w:i/>
+        </w:rPr>
+        <w:t xml:space="preserve"> For example, one </w:t>
+      </w:r>
+      <w:r>
+        <w:rPr>
+          <w:rFonts w:ascii="Calibri" w:hAnsi="Calibri" w:cs="Calibri"/>
+          <w:i/>
+        </w:rPr>
+        <w:t>functional requirement might be,</w:t>
+      </w:r>
+      <w:r>
+        <w:rPr>
+          <w:rFonts w:ascii="Calibri" w:hAnsi="Calibri" w:cs="Calibri"/>
+          <w:i/>
+        </w:rPr>
+        <w:t xml:space="preserve"> “The system shall validate user credentials when logging in.”</w:t>
+      </w:r>
+    </w:p>
+    <w:p>
+      <w:pPr>
+        <w:numPr>
+          <w:ilvl w:val="0"/>
+          <w:numId w:val="2"/>
+        </w:numPr>
+        <w:pBdr>
+          <w:top w:val="nil"/>
+          <w:left w:val="nil"/>
+          <w:bottom w:val="nil"/>
+          <w:right w:val="nil"/>
+          <w:between w:val="nil"/>
+        </w:pBdr>
+        <w:suppressAutoHyphens/>
+        <w:spacing w:after="0" w:line="240" w:lineRule="auto"/>
+        <w:rPr>
+          <w:rFonts w:ascii="Calibri" w:eastAsia="Calibri" w:hAnsi="Calibri" w:cs="Calibri"/>
+          <w:color w:val="000000"/>
+        </w:rPr>
+      </w:pPr>
+      <w:r>
+        <w:rPr>
+          <w:rFonts w:ascii="Calibri" w:eastAsia="Calibri" w:hAnsi="Calibri" w:cs="Calibri"/>
+          <w:color w:val="000000"/>
+        </w:rPr>
         <w:t>[Insert text]</w:t>
       </w:r>
     </w:p>
@@ -1528,7 +2720,7 @@
 </file>
 
 <file path=word/endnotes.xml><?xml version="1.0" encoding="utf-8"?>
-<w:endnotes xmlns:wpc="http://schemas.microsoft.com/office/word/2010/wordprocessingCanvas" xmlns:cx="http://schemas.microsoft.com/office/drawing/2014/chartex" xmlns:cx1="http://schemas.microsoft.com/office/drawing/2015/9/8/chartex" xmlns:cx2="http://schemas.microsoft.com/office/drawing/2015/10/21/chartex" xmlns:cx3="http://schemas.microsoft.com/office/drawing/2016/5/9/chartex" xmlns:cx4="http://schemas.microsoft.com/office/drawing/2016/5/10/chartex" xmlns:cx5="http://schemas.microsoft.com/office/drawing/2016/5/11/chartex" xmlns:cx6="http://schemas.microsoft.com/office/drawing/2016/5/12/chartex" xmlns:cx7="http://schemas.microsoft.com/office/drawing/2016/5/13/chartex" xmlns:cx8="http://schemas.microsoft.com/office/drawing/2016/5/14/chartex" xmlns:mc="http://schemas.openxmlformats.org/markup-compatibility/2006" xmlns:aink="http://schemas.microsoft.com/office/drawing/2016/ink" xmlns:am3d="http://schemas.microsoft.com/office/drawing/2017/model3d" xmlns:o="urn:schemas-microsoft-com:office:office" xmlns:oel="http://schemas.microsoft.com/office/2019/extlst" xmlns:r="http://schemas.openxmlformats.org/officeDocument/2006/relationships" xmlns:m="http://schemas.openxmlformats.org/officeDocument/2006/math" xmlns:v="urn:schemas-microsoft-com:vml" xmlns:wp14="http://schemas.microsoft.com/office/word/2010/wordprocessingDrawing" xmlns:wp="http://schemas.openxmlformats.org/drawingml/2006/wordprocessingDrawing" xmlns:w10="urn:schemas-microsoft-com:office:word" xmlns:w="http://schemas.openxmlformats.org/wordprocessingml/2006/main" xmlns:w14="http://schemas.microsoft.com/office/word/2010/wordml" xmlns:w15="http://schemas.microsoft.com/office/word/2012/wordml" xmlns:w16cex="http://schemas.microsoft.com/office/word/2018/wordml/cex" xmlns:w16cid="http://schemas.microsoft.com/office/word/2016/wordml/cid" xmlns:w16="http://schemas.microsoft.com/office/word/2018/wordml" xmlns:w16du="http://schemas.microsoft.com/office/word/2023/wordml/word16du" xmlns:w16sdtdh="http://schemas.microsoft.com/office/word/2020/wordml/sdtdatahash" xmlns:w16sdtfl="http://schemas.microsoft.com/office/word/2024/wordml/sdtformatlock" xmlns:w16se="http://schemas.microsoft.com/office/word/2015/wordml/symex" xmlns:wpg="http://schemas.microsoft.com/office/word/2010/wordprocessingGroup" xmlns:wpi="http://schemas.microsoft.com/office/word/2010/wordprocessingInk" xmlns:wne="http://schemas.microsoft.com/office/word/2006/wordml" xmlns:wps="http://schemas.microsoft.com/office/word/2010/wordprocessingShape" mc:Ignorable="w14 w15 w16se w16cid w16 w16cex w16sdtdh w16sdtfl w16du wp14">
+<w:endnotes xmlns:wpc="http://schemas.microsoft.com/office/word/2010/wordprocessingCanvas" xmlns:cx="http://schemas.microsoft.com/office/drawing/2014/chartex" xmlns:cx1="http://schemas.microsoft.com/office/drawing/2015/9/8/chartex" xmlns:cx2="http://schemas.microsoft.com/office/drawing/2015/10/21/chartex" xmlns:cx3="http://schemas.microsoft.com/office/drawing/2016/5/9/chartex" xmlns:cx4="http://schemas.microsoft.com/office/drawing/2016/5/10/chartex" xmlns:cx5="http://schemas.microsoft.com/office/drawing/2016/5/11/chartex" xmlns:cx6="http://schemas.microsoft.com/office/drawing/2016/5/12/chartex" xmlns:cx7="http://schemas.microsoft.com/office/drawing/2016/5/13/chartex" xmlns:cx8="http://schemas.microsoft.com/office/drawing/2016/5/14/chartex" xmlns:mc="http://schemas.openxmlformats.org/markup-compatibility/2006" xmlns:aink="http://schemas.microsoft.com/office/drawing/2016/ink" xmlns:am3d="http://schemas.microsoft.com/office/drawing/2017/model3d" xmlns:o="urn:schemas-microsoft-com:office:office" xmlns:oel="http://schemas.microsoft.com/office/2019/extlst" xmlns:r="http://schemas.openxmlformats.org/officeDocument/2006/relationships" xmlns:m="http://schemas.openxmlformats.org/officeDocument/2006/math" xmlns:v="urn:schemas-microsoft-com:vml" xmlns:wp14="http://schemas.microsoft.com/office/word/2010/wordprocessingDrawing" xmlns:wp="http://schemas.openxmlformats.org/drawingml/2006/wordprocessingDrawing" xmlns:w10="urn:schemas-microsoft-com:office:word" xmlns:w="http://schemas.openxmlformats.org/wordprocessingml/2006/main" xmlns:w14="http://schemas.microsoft.com/office/word/2010/wordml" xmlns:w15="http://schemas.microsoft.com/office/word/2012/wordml" xmlns:w16cei="http://schemas.microsoft.com/office/word/2026/wordml/cei" xmlns:w16cex="http://schemas.microsoft.com/office/word/2018/wordml/cex" xmlns:w16cid="http://schemas.microsoft.com/office/word/2016/wordml/cid" xmlns:w16="http://schemas.microsoft.com/office/word/2018/wordml" xmlns:w16du="http://schemas.microsoft.com/office/word/2023/wordml/word16du" xmlns:w16sdtdh="http://schemas.microsoft.com/office/word/2020/wordml/sdtdatahash" xmlns:w16sdtfl="http://schemas.microsoft.com/office/word/2024/wordml/sdtformatlock" xmlns:w16se="http://schemas.microsoft.com/office/word/2015/wordml/symex" xmlns:wpg="http://schemas.microsoft.com/office/word/2010/wordprocessingGroup" xmlns:wpi="http://schemas.microsoft.com/office/word/2010/wordprocessingInk" xmlns:wne="http://schemas.microsoft.com/office/word/2006/wordml" xmlns:wps="http://schemas.microsoft.com/office/word/2010/wordprocessingShape" mc:Ignorable="w14 w15 w16se w16cid w16 w16cex w16sdtdh w16sdtfl w16du wp14">
   <w:endnote w:type="separator" w:id="-1">
     <w:p>
       <w:pPr>
@@ -1553,7 +2745,7 @@
 </file>
 
 <file path=word/footer1.xml><?xml version="1.0" encoding="utf-8"?>
-<w:ftr xmlns:wpc="http://schemas.microsoft.com/office/word/2010/wordprocessingCanvas" xmlns:cx="http://schemas.microsoft.com/office/drawing/2014/chartex" xmlns:cx1="http://schemas.microsoft.com/office/drawing/2015/9/8/chartex" xmlns:cx2="http://schemas.microsoft.com/office/drawing/2015/10/21/chartex" xmlns:cx3="http://schemas.microsoft.com/office/drawing/2016/5/9/chartex" xmlns:cx4="http://schemas.microsoft.com/office/drawing/2016/5/10/chartex" xmlns:cx5="http://schemas.microsoft.com/office/drawing/2016/5/11/chartex" xmlns:cx6="http://schemas.microsoft.com/office/drawing/2016/5/12/chartex" xmlns:cx7="http://schemas.microsoft.com/office/drawing/2016/5/13/chartex" xmlns:cx8="http://schemas.microsoft.com/office/drawing/2016/5/14/chartex" xmlns:mc="http://schemas.openxmlformats.org/markup-compatibility/2006" xmlns:aink="http://schemas.microsoft.com/office/drawing/2016/ink" xmlns:am3d="http://schemas.microsoft.com/office/drawing/2017/model3d" xmlns:o="urn:schemas-microsoft-com:office:office" xmlns:oel="http://schemas.microsoft.com/office/2019/extlst" xmlns:r="http://schemas.openxmlformats.org/officeDocument/2006/relationships" xmlns:m="http://schemas.openxmlformats.org/officeDocument/2006/math" xmlns:v="urn:schemas-microsoft-com:vml" xmlns:wp14="http://schemas.microsoft.com/office/word/2010/wordprocessingDrawing" xmlns:wp="http://schemas.openxmlformats.org/drawingml/2006/wordprocessingDrawing" xmlns:w10="urn:schemas-microsoft-com:office:word" xmlns:w="http://schemas.openxmlformats.org/wordprocessingml/2006/main" xmlns:w14="http://schemas.microsoft.com/office/word/2010/wordml" xmlns:w15="http://schemas.microsoft.com/office/word/2012/wordml" xmlns:w16cex="http://schemas.microsoft.com/office/word/2018/wordml/cex" xmlns:w16cid="http://schemas.microsoft.com/office/word/2016/wordml/cid" xmlns:w16="http://schemas.microsoft.com/office/word/2018/wordml" xmlns:w16du="http://schemas.microsoft.com/office/word/2023/wordml/word16du" xmlns:w16sdtdh="http://schemas.microsoft.com/office/word/2020/wordml/sdtdatahash" xmlns:w16sdtfl="http://schemas.microsoft.com/office/word/2024/wordml/sdtformatlock" xmlns:w16se="http://schemas.microsoft.com/office/word/2015/wordml/symex" xmlns:wpg="http://schemas.microsoft.com/office/word/2010/wordprocessingGroup" xmlns:wpi="http://schemas.microsoft.com/office/word/2010/wordprocessingInk" xmlns:wne="http://schemas.microsoft.com/office/word/2006/wordml" xmlns:wps="http://schemas.microsoft.com/office/word/2010/wordprocessingShape" mc:Ignorable="w14 w15 w16se w16cid w16 w16cex w16sdtdh w16sdtfl w16du wp14">
+<w:ftr xmlns:wpc="http://schemas.microsoft.com/office/word/2010/wordprocessingCanvas" xmlns:cx="http://schemas.microsoft.com/office/drawing/2014/chartex" xmlns:cx1="http://schemas.microsoft.com/office/drawing/2015/9/8/chartex" xmlns:cx2="http://schemas.microsoft.com/office/drawing/2015/10/21/chartex" xmlns:cx3="http://schemas.microsoft.com/office/drawing/2016/5/9/chartex" xmlns:cx4="http://schemas.microsoft.com/office/drawing/2016/5/10/chartex" xmlns:cx5="http://schemas.microsoft.com/office/drawing/2016/5/11/chartex" xmlns:cx6="http://schemas.microsoft.com/office/drawing/2016/5/12/chartex" xmlns:cx7="http://schemas.microsoft.com/office/drawing/2016/5/13/chartex" xmlns:cx8="http://schemas.microsoft.com/office/drawing/2016/5/14/chartex" xmlns:mc="http://schemas.openxmlformats.org/markup-compatibility/2006" xmlns:aink="http://schemas.microsoft.com/office/drawing/2016/ink" xmlns:am3d="http://schemas.microsoft.com/office/drawing/2017/model3d" xmlns:o="urn:schemas-microsoft-com:office:office" xmlns:oel="http://schemas.microsoft.com/office/2019/extlst" xmlns:r="http://schemas.openxmlformats.org/officeDocument/2006/relationships" xmlns:m="http://schemas.openxmlformats.org/officeDocument/2006/math" xmlns:v="urn:schemas-microsoft-com:vml" xmlns:wp14="http://schemas.microsoft.com/office/word/2010/wordprocessingDrawing" xmlns:wp="http://schemas.openxmlformats.org/drawingml/2006/wordprocessingDrawing" xmlns:w10="urn:schemas-microsoft-com:office:word" xmlns:w="http://schemas.openxmlformats.org/wordprocessingml/2006/main" xmlns:w14="http://schemas.microsoft.com/office/word/2010/wordml" xmlns:w15="http://schemas.microsoft.com/office/word/2012/wordml" xmlns:w16cei="http://schemas.microsoft.com/office/word/2026/wordml/cei" xmlns:w16cex="http://schemas.microsoft.com/office/word/2018/wordml/cex" xmlns:w16cid="http://schemas.microsoft.com/office/word/2016/wordml/cid" xmlns:w16="http://schemas.microsoft.com/office/word/2018/wordml" xmlns:w16du="http://schemas.microsoft.com/office/word/2023/wordml/word16du" xmlns:w16sdtdh="http://schemas.microsoft.com/office/word/2020/wordml/sdtdatahash" xmlns:w16sdtfl="http://schemas.microsoft.com/office/word/2024/wordml/sdtformatlock" xmlns:w16se="http://schemas.microsoft.com/office/word/2015/wordml/symex" xmlns:wpg="http://schemas.microsoft.com/office/word/2010/wordprocessingGroup" xmlns:wpi="http://schemas.microsoft.com/office/word/2010/wordprocessingInk" xmlns:wne="http://schemas.microsoft.com/office/word/2006/wordml" xmlns:wps="http://schemas.microsoft.com/office/word/2010/wordprocessingShape" mc:Ignorable="w14 w15 w16se w16cid w16 w16cex w16sdtdh w16sdtfl w16du wp14">
   <w:sdt>
     <w:sdtPr>
       <w:id w:val="140317929"/>
@@ -1600,7 +2792,7 @@
 </file>
 
 <file path=word/footnotes.xml><?xml version="1.0" encoding="utf-8"?>
-<w:footnotes xmlns:wpc="http://schemas.microsoft.com/office/word/2010/wordprocessingCanvas" xmlns:cx="http://schemas.microsoft.com/office/drawing/2014/chartex" xmlns:cx1="http://schemas.microsoft.com/office/drawing/2015/9/8/chartex" xmlns:cx2="http://schemas.microsoft.com/office/drawing/2015/10/21/chartex" xmlns:cx3="http://schemas.microsoft.com/office/drawing/2016/5/9/chartex" xmlns:cx4="http://schemas.microsoft.com/office/drawing/2016/5/10/chartex" xmlns:cx5="http://schemas.microsoft.com/office/drawing/2016/5/11/chartex" xmlns:cx6="http://schemas.microsoft.com/office/drawing/2016/5/12/chartex" xmlns:cx7="http://schemas.microsoft.com/office/drawing/2016/5/13/chartex" xmlns:cx8="http://schemas.microsoft.com/office/drawing/2016/5/14/chartex" xmlns:mc="http://schemas.openxmlformats.org/markup-compatibility/2006" xmlns:aink="http://schemas.microsoft.com/office/drawing/2016/ink" xmlns:am3d="http://schemas.microsoft.com/office/drawing/2017/model3d" xmlns:o="urn:schemas-microsoft-com:office:office" xmlns:oel="http://schemas.microsoft.com/office/2019/extlst" xmlns:r="http://schemas.openxmlformats.org/officeDocument/2006/relationships" xmlns:m="http://schemas.openxmlformats.org/officeDocument/2006/math" xmlns:v="urn:schemas-microsoft-com:vml" xmlns:wp14="http://schemas.microsoft.com/office/word/2010/wordprocessingDrawing" xmlns:wp="http://schemas.openxmlformats.org/drawingml/2006/wordprocessingDrawing" xmlns:w10="urn:schemas-microsoft-com:office:word" xmlns:w="http://schemas.openxmlformats.org/wordprocessingml/2006/main" xmlns:w14="http://schemas.microsoft.com/office/word/2010/wordml" xmlns:w15="http://schemas.microsoft.com/office/word/2012/wordml" xmlns:w16cex="http://schemas.microsoft.com/office/word/2018/wordml/cex" xmlns:w16cid="http://schemas.microsoft.com/office/word/2016/wordml/cid" xmlns:w16="http://schemas.microsoft.com/office/word/2018/wordml" xmlns:w16du="http://schemas.microsoft.com/office/word/2023/wordml/word16du" xmlns:w16sdtdh="http://schemas.microsoft.com/office/word/2020/wordml/sdtdatahash" xmlns:w16sdtfl="http://schemas.microsoft.com/office/word/2024/wordml/sdtformatlock" xmlns:w16se="http://schemas.microsoft.com/office/word/2015/wordml/symex" xmlns:wpg="http://schemas.microsoft.com/office/word/2010/wordprocessingGroup" xmlns:wpi="http://schemas.microsoft.com/office/word/2010/wordprocessingInk" xmlns:wne="http://schemas.microsoft.com/office/word/2006/wordml" xmlns:wps="http://schemas.microsoft.com/office/word/2010/wordprocessingShape" mc:Ignorable="w14 w15 w16se w16cid w16 w16cex w16sdtdh w16sdtfl w16du wp14">
+<w:footnotes xmlns:wpc="http://schemas.microsoft.com/office/word/2010/wordprocessingCanvas" xmlns:cx="http://schemas.microsoft.com/office/drawing/2014/chartex" xmlns:cx1="http://schemas.microsoft.com/office/drawing/2015/9/8/chartex" xmlns:cx2="http://schemas.microsoft.com/office/drawing/2015/10/21/chartex" xmlns:cx3="http://schemas.microsoft.com/office/drawing/2016/5/9/chartex" xmlns:cx4="http://schemas.microsoft.com/office/drawing/2016/5/10/chartex" xmlns:cx5="http://schemas.microsoft.com/office/drawing/2016/5/11/chartex" xmlns:cx6="http://schemas.microsoft.com/office/drawing/2016/5/12/chartex" xmlns:cx7="http://schemas.microsoft.com/office/drawing/2016/5/13/chartex" xmlns:cx8="http://schemas.microsoft.com/office/drawing/2016/5/14/chartex" xmlns:mc="http://schemas.openxmlformats.org/markup-compatibility/2006" xmlns:aink="http://schemas.microsoft.com/office/drawing/2016/ink" xmlns:am3d="http://schemas.microsoft.com/office/drawing/2017/model3d" xmlns:o="urn:schemas-microsoft-com:office:office" xmlns:oel="http://schemas.microsoft.com/office/2019/extlst" xmlns:r="http://schemas.openxmlformats.org/officeDocument/2006/relationships" xmlns:m="http://schemas.openxmlformats.org/officeDocument/2006/math" xmlns:v="urn:schemas-microsoft-com:vml" xmlns:wp14="http://schemas.microsoft.com/office/word/2010/wordprocessingDrawing" xmlns:wp="http://schemas.openxmlformats.org/drawingml/2006/wordprocessingDrawing" xmlns:w10="urn:schemas-microsoft-com:office:word" xmlns:w="http://schemas.openxmlformats.org/wordprocessingml/2006/main" xmlns:w14="http://schemas.microsoft.com/office/word/2010/wordml" xmlns:w15="http://schemas.microsoft.com/office/word/2012/wordml" xmlns:w16cei="http://schemas.microsoft.com/office/word/2026/wordml/cei" xmlns:w16cex="http://schemas.microsoft.com/office/word/2018/wordml/cex" xmlns:w16cid="http://schemas.microsoft.com/office/word/2016/wordml/cid" xmlns:w16="http://schemas.microsoft.com/office/word/2018/wordml" xmlns:w16du="http://schemas.microsoft.com/office/word/2023/wordml/word16du" xmlns:w16sdtdh="http://schemas.microsoft.com/office/word/2020/wordml/sdtdatahash" xmlns:w16sdtfl="http://schemas.microsoft.com/office/word/2024/wordml/sdtformatlock" xmlns:w16se="http://schemas.microsoft.com/office/word/2015/wordml/symex" xmlns:wpg="http://schemas.microsoft.com/office/word/2010/wordprocessingGroup" xmlns:wpi="http://schemas.microsoft.com/office/word/2010/wordprocessingInk" xmlns:wne="http://schemas.microsoft.com/office/word/2006/wordml" xmlns:wps="http://schemas.microsoft.com/office/word/2010/wordprocessingShape" mc:Ignorable="w14 w15 w16se w16cid w16 w16cex w16sdtdh w16sdtfl w16du wp14">
   <w:footnote w:type="separator" w:id="-1">
     <w:p>
       <w:pPr>
@@ -1625,7 +2817,7 @@
 </file>
 
 <file path=word/header1.xml><?xml version="1.0" encoding="utf-8"?>
-<w:hdr xmlns:wpc="http://schemas.microsoft.com/office/word/2010/wordprocessingCanvas" xmlns:cx="http://schemas.microsoft.com/office/drawing/2014/chartex" xmlns:cx1="http://schemas.microsoft.com/office/drawing/2015/9/8/chartex" xmlns:cx2="http://schemas.microsoft.com/office/drawing/2015/10/21/chartex" xmlns:cx3="http://schemas.microsoft.com/office/drawing/2016/5/9/chartex" xmlns:cx4="http://schemas.microsoft.com/office/drawing/2016/5/10/chartex" xmlns:cx5="http://schemas.microsoft.com/office/drawing/2016/5/11/chartex" xmlns:cx6="http://schemas.microsoft.com/office/drawing/2016/5/12/chartex" xmlns:cx7="http://schemas.microsoft.com/office/drawing/2016/5/13/chartex" xmlns:cx8="http://schemas.microsoft.com/office/drawing/2016/5/14/chartex" xmlns:mc="http://schemas.openxmlformats.org/markup-compatibility/2006" xmlns:aink="http://schemas.microsoft.com/office/drawing/2016/ink" xmlns:am3d="http://schemas.microsoft.com/office/drawing/2017/model3d" xmlns:o="urn:schemas-microsoft-com:office:office" xmlns:oel="http://schemas.microsoft.com/office/2019/extlst" xmlns:r="http://schemas.openxmlformats.org/officeDocument/2006/relationships" xmlns:m="http://schemas.openxmlformats.org/officeDocument/2006/math" xmlns:v="urn:schemas-microsoft-com:vml" xmlns:wp14="http://schemas.microsoft.com/office/word/2010/wordprocessingDrawing" xmlns:wp="http://schemas.openxmlformats.org/drawingml/2006/wordprocessingDrawing" xmlns:w10="urn:schemas-microsoft-com:office:word" xmlns:w="http://schemas.openxmlformats.org/wordprocessingml/2006/main" xmlns:w14="http://schemas.microsoft.com/office/word/2010/wordml" xmlns:w15="http://schemas.microsoft.com/office/word/2012/wordml" xmlns:w16cex="http://schemas.microsoft.com/office/word/2018/wordml/cex" xmlns:w16cid="http://schemas.microsoft.com/office/word/2016/wordml/cid" xmlns:w16="http://schemas.microsoft.com/office/word/2018/wordml" xmlns:w16du="http://schemas.microsoft.com/office/word/2023/wordml/word16du" xmlns:w16sdtdh="http://schemas.microsoft.com/office/word/2020/wordml/sdtdatahash" xmlns:w16sdtfl="http://schemas.microsoft.com/office/word/2024/wordml/sdtformatlock" xmlns:w16se="http://schemas.microsoft.com/office/word/2015/wordml/symex" xmlns:wpg="http://schemas.microsoft.com/office/word/2010/wordprocessingGroup" xmlns:wpi="http://schemas.microsoft.com/office/word/2010/wordprocessingInk" xmlns:wne="http://schemas.microsoft.com/office/word/2006/wordml" xmlns:wps="http://schemas.microsoft.com/office/word/2010/wordprocessingShape" mc:Ignorable="w14 w15 w16se w16cid w16 w16cex w16sdtdh w16sdtfl w16du wp14">
+<w:hdr xmlns:wpc="http://schemas.microsoft.com/office/word/2010/wordprocessingCanvas" xmlns:cx="http://schemas.microsoft.com/office/drawing/2014/chartex" xmlns:cx1="http://schemas.microsoft.com/office/drawing/2015/9/8/chartex" xmlns:cx2="http://schemas.microsoft.com/office/drawing/2015/10/21/chartex" xmlns:cx3="http://schemas.microsoft.com/office/drawing/2016/5/9/chartex" xmlns:cx4="http://schemas.microsoft.com/office/drawing/2016/5/10/chartex" xmlns:cx5="http://schemas.microsoft.com/office/drawing/2016/5/11/chartex" xmlns:cx6="http://schemas.microsoft.com/office/drawing/2016/5/12/chartex" xmlns:cx7="http://schemas.microsoft.com/office/drawing/2016/5/13/chartex" xmlns:cx8="http://schemas.microsoft.com/office/drawing/2016/5/14/chartex" xmlns:mc="http://schemas.openxmlformats.org/markup-compatibility/2006" xmlns:aink="http://schemas.microsoft.com/office/drawing/2016/ink" xmlns:am3d="http://schemas.microsoft.com/office/drawing/2017/model3d" xmlns:o="urn:schemas-microsoft-com:office:office" xmlns:oel="http://schemas.microsoft.com/office/2019/extlst" xmlns:r="http://schemas.openxmlformats.org/officeDocument/2006/relationships" xmlns:m="http://schemas.openxmlformats.org/officeDocument/2006/math" xmlns:v="urn:schemas-microsoft-com:vml" xmlns:wp14="http://schemas.microsoft.com/office/word/2010/wordprocessingDrawing" xmlns:wp="http://schemas.openxmlformats.org/drawingml/2006/wordprocessingDrawing" xmlns:w10="urn:schemas-microsoft-com:office:word" xmlns:w="http://schemas.openxmlformats.org/wordprocessingml/2006/main" xmlns:w14="http://schemas.microsoft.com/office/word/2010/wordml" xmlns:w15="http://schemas.microsoft.com/office/word/2012/wordml" xmlns:w16cei="http://schemas.microsoft.com/office/word/2026/wordml/cei" xmlns:w16cex="http://schemas.microsoft.com/office/word/2018/wordml/cex" xmlns:w16cid="http://schemas.microsoft.com/office/word/2016/wordml/cid" xmlns:w16="http://schemas.microsoft.com/office/word/2018/wordml" xmlns:w16du="http://schemas.microsoft.com/office/word/2023/wordml/word16du" xmlns:w16sdtdh="http://schemas.microsoft.com/office/word/2020/wordml/sdtdatahash" xmlns:w16sdtfl="http://schemas.microsoft.com/office/word/2024/wordml/sdtformatlock" xmlns:w16se="http://schemas.microsoft.com/office/word/2015/wordml/symex" xmlns:wpg="http://schemas.microsoft.com/office/word/2010/wordprocessingGroup" xmlns:wpi="http://schemas.microsoft.com/office/word/2010/wordprocessingInk" xmlns:wne="http://schemas.microsoft.com/office/word/2006/wordml" xmlns:wps="http://schemas.microsoft.com/office/word/2010/wordprocessingShape" mc:Ignorable="w14 w15 w16se w16cid w16 w16cex w16sdtdh w16sdtfl w16du wp14">
   <w:p>
     <w:pPr>
       <w:pStyle w:val="Header"/>
@@ -1683,8 +2875,121 @@
 </file>
 
 <file path=word/numbering.xml><?xml version="1.0" encoding="utf-8"?>
-<w:numbering xmlns:wpc="http://schemas.microsoft.com/office/word/2010/wordprocessingCanvas" xmlns:cx="http://schemas.microsoft.com/office/drawing/2014/chartex" xmlns:cx1="http://schemas.microsoft.com/office/drawing/2015/9/8/chartex" xmlns:cx2="http://schemas.microsoft.com/office/drawing/2015/10/21/chartex" xmlns:cx3="http://schemas.microsoft.com/office/drawing/2016/5/9/chartex" xmlns:cx4="http://schemas.microsoft.com/office/drawing/2016/5/10/chartex" xmlns:cx5="http://schemas.microsoft.com/office/drawing/2016/5/11/chartex" xmlns:cx6="http://schemas.microsoft.com/office/drawing/2016/5/12/chartex" xmlns:cx7="http://schemas.microsoft.com/office/drawing/2016/5/13/chartex" xmlns:cx8="http://schemas.microsoft.com/office/drawing/2016/5/14/chartex" xmlns:mc="http://schemas.openxmlformats.org/markup-compatibility/2006" xmlns:aink="http://schemas.microsoft.com/office/drawing/2016/ink" xmlns:am3d="http://schemas.microsoft.com/office/drawing/2017/model3d" xmlns:o="urn:schemas-microsoft-com:office:office" xmlns:oel="http://schemas.microsoft.com/office/2019/extlst" xmlns:r="http://schemas.openxmlformats.org/officeDocument/2006/relationships" xmlns:m="http://schemas.openxmlformats.org/officeDocument/2006/math" xmlns:v="urn:schemas-microsoft-com:vml" xmlns:wp14="http://schemas.microsoft.com/office/word/2010/wordprocessingDrawing" xmlns:wp="http://schemas.openxmlformats.org/drawingml/2006/wordprocessingDrawing" xmlns:w10="urn:schemas-microsoft-com:office:word" xmlns:w="http://schemas.openxmlformats.org/wordprocessingml/2006/main" xmlns:w14="http://schemas.microsoft.com/office/word/2010/wordml" xmlns:w15="http://schemas.microsoft.com/office/word/2012/wordml" xmlns:w16cex="http://schemas.microsoft.com/office/word/2018/wordml/cex" xmlns:w16cid="http://schemas.microsoft.com/office/word/2016/wordml/cid" xmlns:w16="http://schemas.microsoft.com/office/word/2018/wordml" xmlns:w16du="http://schemas.microsoft.com/office/word/2023/wordml/word16du" xmlns:w16sdtdh="http://schemas.microsoft.com/office/word/2020/wordml/sdtdatahash" xmlns:w16sdtfl="http://schemas.microsoft.com/office/word/2024/wordml/sdtformatlock" xmlns:w16se="http://schemas.microsoft.com/office/word/2015/wordml/symex" xmlns:wpg="http://schemas.microsoft.com/office/word/2010/wordprocessingGroup" xmlns:wpi="http://schemas.microsoft.com/office/word/2010/wordprocessingInk" xmlns:wne="http://schemas.microsoft.com/office/word/2006/wordml" xmlns:wps="http://schemas.microsoft.com/office/word/2010/wordprocessingShape" mc:Ignorable="w14 w15 w16se w16cid w16 w16cex w16sdtdh w16sdtfl w16du wp14">
+<w:numbering xmlns:wpc="http://schemas.microsoft.com/office/word/2010/wordprocessingCanvas" xmlns:cx="http://schemas.microsoft.com/office/drawing/2014/chartex" xmlns:cx1="http://schemas.microsoft.com/office/drawing/2015/9/8/chartex" xmlns:cx2="http://schemas.microsoft.com/office/drawing/2015/10/21/chartex" xmlns:cx3="http://schemas.microsoft.com/office/drawing/2016/5/9/chartex" xmlns:cx4="http://schemas.microsoft.com/office/drawing/2016/5/10/chartex" xmlns:cx5="http://schemas.microsoft.com/office/drawing/2016/5/11/chartex" xmlns:cx6="http://schemas.microsoft.com/office/drawing/2016/5/12/chartex" xmlns:cx7="http://schemas.microsoft.com/office/drawing/2016/5/13/chartex" xmlns:cx8="http://schemas.microsoft.com/office/drawing/2016/5/14/chartex" xmlns:mc="http://schemas.openxmlformats.org/markup-compatibility/2006" xmlns:aink="http://schemas.microsoft.com/office/drawing/2016/ink" xmlns:am3d="http://schemas.microsoft.com/office/drawing/2017/model3d" xmlns:o="urn:schemas-microsoft-com:office:office" xmlns:oel="http://schemas.microsoft.com/office/2019/extlst" xmlns:r="http://schemas.openxmlformats.org/officeDocument/2006/relationships" xmlns:m="http://schemas.openxmlformats.org/officeDocument/2006/math" xmlns:v="urn:schemas-microsoft-com:vml" xmlns:wp14="http://schemas.microsoft.com/office/word/2010/wordprocessingDrawing" xmlns:wp="http://schemas.openxmlformats.org/drawingml/2006/wordprocessingDrawing" xmlns:w10="urn:schemas-microsoft-com:office:word" xmlns:w="http://schemas.openxmlformats.org/wordprocessingml/2006/main" xmlns:w14="http://schemas.microsoft.com/office/word/2010/wordml" xmlns:w15="http://schemas.microsoft.com/office/word/2012/wordml" xmlns:w16cei="http://schemas.microsoft.com/office/word/2026/wordml/cei" xmlns:w16cex="http://schemas.microsoft.com/office/word/2018/wordml/cex" xmlns:w16cid="http://schemas.microsoft.com/office/word/2016/wordml/cid" xmlns:w16="http://schemas.microsoft.com/office/word/2018/wordml" xmlns:w16du="http://schemas.microsoft.com/office/word/2023/wordml/word16du" xmlns:w16sdtdh="http://schemas.microsoft.com/office/word/2020/wordml/sdtdatahash" xmlns:w16sdtfl="http://schemas.microsoft.com/office/word/2024/wordml/sdtformatlock" xmlns:w16se="http://schemas.microsoft.com/office/word/2015/wordml/symex" xmlns:wpg="http://schemas.microsoft.com/office/word/2010/wordprocessingGroup" xmlns:wpi="http://schemas.microsoft.com/office/word/2010/wordprocessingInk" xmlns:wne="http://schemas.microsoft.com/office/word/2006/wordml" xmlns:wps="http://schemas.microsoft.com/office/word/2010/wordprocessingShape" mc:Ignorable="w14 w15 w16se w16cid w16 w16cex w16sdtdh w16sdtfl w16du wp14">
   <w:abstractNum w:abstractNumId="0" w15:restartNumberingAfterBreak="0">
+    <w:nsid w:val="11982254"/>
+    <w:multiLevelType w:val="hybridMultilevel"/>
+    <w:tmpl w:val="47ACE57C"/>
+    <w:lvl w:ilvl="0" w:tplc="04090001">
+      <w:start w:val="1"/>
+      <w:numFmt w:val="bullet"/>
+      <w:lvlText w:val=""/>
+      <w:lvlJc w:val="left"/>
+      <w:pPr>
+        <w:ind w:left="720" w:hanging="360"/>
+      </w:pPr>
+      <w:rPr>
+        <w:rFonts w:ascii="Symbol" w:hAnsi="Symbol" w:hint="default"/>
+      </w:rPr>
+    </w:lvl>
+    <w:lvl w:ilvl="1" w:tplc="04090003" w:tentative="1">
+      <w:start w:val="1"/>
+      <w:numFmt w:val="bullet"/>
+      <w:lvlText w:val="o"/>
+      <w:lvlJc w:val="left"/>
+      <w:pPr>
+        <w:ind w:left="1440" w:hanging="360"/>
+      </w:pPr>
+      <w:rPr>
+        <w:rFonts w:ascii="Courier New" w:hAnsi="Courier New" w:cs="Courier New" w:hint="default"/>
+      </w:rPr>
+    </w:lvl>
+    <w:lvl w:ilvl="2" w:tplc="04090005" w:tentative="1">
+      <w:start w:val="1"/>
+      <w:numFmt w:val="bullet"/>
+      <w:lvlText w:val=""/>
+      <w:lvlJc w:val="left"/>
+      <w:pPr>
+        <w:ind w:left="2160" w:hanging="360"/>
+      </w:pPr>
+      <w:rPr>
+        <w:rFonts w:ascii="Wingdings" w:hAnsi="Wingdings" w:hint="default"/>
+      </w:rPr>
+    </w:lvl>
+    <w:lvl w:ilvl="3" w:tplc="04090001" w:tentative="1">
+      <w:start w:val="1"/>
+      <w:numFmt w:val="bullet"/>
+      <w:lvlText w:val=""/>
+      <w:lvlJc w:val="left"/>
+      <w:pPr>
+        <w:ind w:left="2880" w:hanging="360"/>
+      </w:pPr>
+      <w:rPr>
+        <w:rFonts w:ascii="Symbol" w:hAnsi="Symbol" w:hint="default"/>
+      </w:rPr>
+    </w:lvl>
+    <w:lvl w:ilvl="4" w:tplc="04090003" w:tentative="1">
+      <w:start w:val="1"/>
+      <w:numFmt w:val="bullet"/>
+      <w:lvlText w:val="o"/>
+      <w:lvlJc w:val="left"/>
+      <w:pPr>
+        <w:ind w:left="3600" w:hanging="360"/>
+      </w:pPr>
+      <w:rPr>
+        <w:rFonts w:ascii="Courier New" w:hAnsi="Courier New" w:cs="Courier New" w:hint="default"/>
+      </w:rPr>
+    </w:lvl>
+    <w:lvl w:ilvl="5" w:tplc="04090005" w:tentative="1">
+      <w:start w:val="1"/>
+      <w:numFmt w:val="bullet"/>
+      <w:lvlText w:val=""/>
+      <w:lvlJc w:val="left"/>
+      <w:pPr>
+        <w:ind w:left="4320" w:hanging="360"/>
+      </w:pPr>
+      <w:rPr>
+        <w:rFonts w:ascii="Wingdings" w:hAnsi="Wingdings" w:hint="default"/>
+      </w:rPr>
+    </w:lvl>
+    <w:lvl w:ilvl="6" w:tplc="04090001" w:tentative="1">
+      <w:start w:val="1"/>
+      <w:numFmt w:val="bullet"/>
+      <w:lvlText w:val=""/>
+      <w:lvlJc w:val="left"/>
+      <w:pPr>
+        <w:ind w:left="5040" w:hanging="360"/>
+      </w:pPr>
+      <w:rPr>
+        <w:rFonts w:ascii="Symbol" w:hAnsi="Symbol" w:hint="default"/>
+      </w:rPr>
+    </w:lvl>
+    <w:lvl w:ilvl="7" w:tplc="04090003" w:tentative="1">
+      <w:start w:val="1"/>
+      <w:numFmt w:val="bullet"/>
+      <w:lvlText w:val="o"/>
+      <w:lvlJc w:val="left"/>
+      <w:pPr>
+        <w:ind w:left="5760" w:hanging="360"/>
+      </w:pPr>
+      <w:rPr>
+        <w:rFonts w:ascii="Courier New" w:hAnsi="Courier New" w:cs="Courier New" w:hint="default"/>
+      </w:rPr>
+    </w:lvl>
+    <w:lvl w:ilvl="8" w:tplc="04090005" w:tentative="1">
+      <w:start w:val="1"/>
+      <w:numFmt w:val="bullet"/>
+      <w:lvlText w:val=""/>
+      <w:lvlJc w:val="left"/>
+      <w:pPr>
+        <w:ind w:left="6480" w:hanging="360"/>
+      </w:pPr>
+      <w:rPr>
+        <w:rFonts w:ascii="Wingdings" w:hAnsi="Wingdings" w:hint="default"/>
+      </w:rPr>
+    </w:lvl>
+  </w:abstractNum>
+  <w:abstractNum w:abstractNumId="1" w15:restartNumberingAfterBreak="0">
     <w:nsid w:val="16806C4C"/>
     <w:multiLevelType w:val="hybridMultilevel"/>
     <w:tmpl w:val="CBA4DDAE"/>
@@ -1797,7 +3102,7 @@
       </w:rPr>
     </w:lvl>
   </w:abstractNum>
-  <w:abstractNum w:abstractNumId="1" w15:restartNumberingAfterBreak="0">
+  <w:abstractNum w:abstractNumId="2" w15:restartNumberingAfterBreak="0">
     <w:nsid w:val="19976EDA"/>
     <w:multiLevelType w:val="multilevel"/>
     <w:tmpl w:val="67083CAE"/>
@@ -1910,7 +3215,382 @@
       </w:rPr>
     </w:lvl>
   </w:abstractNum>
-  <w:abstractNum w:abstractNumId="2" w15:restartNumberingAfterBreak="0">
+  <w:abstractNum w:abstractNumId="3" w15:restartNumberingAfterBreak="0">
+    <w:nsid w:val="19C847FA"/>
+    <w:multiLevelType w:val="hybridMultilevel"/>
+    <w:tmpl w:val="0A329FF2"/>
+    <w:lvl w:ilvl="0" w:tplc="04090001">
+      <w:start w:val="1"/>
+      <w:numFmt w:val="bullet"/>
+      <w:lvlText w:val=""/>
+      <w:lvlJc w:val="left"/>
+      <w:pPr>
+        <w:ind w:left="720" w:hanging="360"/>
+      </w:pPr>
+      <w:rPr>
+        <w:rFonts w:ascii="Symbol" w:hAnsi="Symbol" w:hint="default"/>
+      </w:rPr>
+    </w:lvl>
+    <w:lvl w:ilvl="1" w:tplc="04090003" w:tentative="1">
+      <w:start w:val="1"/>
+      <w:numFmt w:val="bullet"/>
+      <w:lvlText w:val="o"/>
+      <w:lvlJc w:val="left"/>
+      <w:pPr>
+        <w:ind w:left="1440" w:hanging="360"/>
+      </w:pPr>
+      <w:rPr>
+        <w:rFonts w:ascii="Courier New" w:hAnsi="Courier New" w:cs="Courier New" w:hint="default"/>
+      </w:rPr>
+    </w:lvl>
+    <w:lvl w:ilvl="2" w:tplc="04090005" w:tentative="1">
+      <w:start w:val="1"/>
+      <w:numFmt w:val="bullet"/>
+      <w:lvlText w:val=""/>
+      <w:lvlJc w:val="left"/>
+      <w:pPr>
+        <w:ind w:left="2160" w:hanging="360"/>
+      </w:pPr>
+      <w:rPr>
+        <w:rFonts w:ascii="Wingdings" w:hAnsi="Wingdings" w:hint="default"/>
+      </w:rPr>
+    </w:lvl>
+    <w:lvl w:ilvl="3" w:tplc="04090001" w:tentative="1">
+      <w:start w:val="1"/>
+      <w:numFmt w:val="bullet"/>
+      <w:lvlText w:val=""/>
+      <w:lvlJc w:val="left"/>
+      <w:pPr>
+        <w:ind w:left="2880" w:hanging="360"/>
+      </w:pPr>
+      <w:rPr>
+        <w:rFonts w:ascii="Symbol" w:hAnsi="Symbol" w:hint="default"/>
+      </w:rPr>
+    </w:lvl>
+    <w:lvl w:ilvl="4" w:tplc="04090003" w:tentative="1">
+      <w:start w:val="1"/>
+      <w:numFmt w:val="bullet"/>
+      <w:lvlText w:val="o"/>
+      <w:lvlJc w:val="left"/>
+      <w:pPr>
+        <w:ind w:left="3600" w:hanging="360"/>
+      </w:pPr>
+      <w:rPr>
+        <w:rFonts w:ascii="Courier New" w:hAnsi="Courier New" w:cs="Courier New" w:hint="default"/>
+      </w:rPr>
+    </w:lvl>
+    <w:lvl w:ilvl="5" w:tplc="04090005" w:tentative="1">
+      <w:start w:val="1"/>
+      <w:numFmt w:val="bullet"/>
+      <w:lvlText w:val=""/>
+      <w:lvlJc w:val="left"/>
+      <w:pPr>
+        <w:ind w:left="4320" w:hanging="360"/>
+      </w:pPr>
+      <w:rPr>
+        <w:rFonts w:ascii="Wingdings" w:hAnsi="Wingdings" w:hint="default"/>
+      </w:rPr>
+    </w:lvl>
+    <w:lvl w:ilvl="6" w:tplc="04090001" w:tentative="1">
+      <w:start w:val="1"/>
+      <w:numFmt w:val="bullet"/>
+      <w:lvlText w:val=""/>
+      <w:lvlJc w:val="left"/>
+      <w:pPr>
+        <w:ind w:left="5040" w:hanging="360"/>
+      </w:pPr>
+      <w:rPr>
+        <w:rFonts w:ascii="Symbol" w:hAnsi="Symbol" w:hint="default"/>
+      </w:rPr>
+    </w:lvl>
+    <w:lvl w:ilvl="7" w:tplc="04090003" w:tentative="1">
+      <w:start w:val="1"/>
+      <w:numFmt w:val="bullet"/>
+      <w:lvlText w:val="o"/>
+      <w:lvlJc w:val="left"/>
+      <w:pPr>
+        <w:ind w:left="5760" w:hanging="360"/>
+      </w:pPr>
+      <w:rPr>
+        <w:rFonts w:ascii="Courier New" w:hAnsi="Courier New" w:cs="Courier New" w:hint="default"/>
+      </w:rPr>
+    </w:lvl>
+    <w:lvl w:ilvl="8" w:tplc="04090005" w:tentative="1">
+      <w:start w:val="1"/>
+      <w:numFmt w:val="bullet"/>
+      <w:lvlText w:val=""/>
+      <w:lvlJc w:val="left"/>
+      <w:pPr>
+        <w:ind w:left="6480" w:hanging="360"/>
+      </w:pPr>
+      <w:rPr>
+        <w:rFonts w:ascii="Wingdings" w:hAnsi="Wingdings" w:hint="default"/>
+      </w:rPr>
+    </w:lvl>
+  </w:abstractNum>
+  <w:abstractNum w:abstractNumId="4" w15:restartNumberingAfterBreak="0">
+    <w:nsid w:val="1C1A3B19"/>
+    <w:multiLevelType w:val="multilevel"/>
+    <w:tmpl w:val="18DE6F3C"/>
+    <w:lvl w:ilvl="0">
+      <w:start w:val="1"/>
+      <w:numFmt w:val="bullet"/>
+      <w:lvlText w:val=""/>
+      <w:lvlJc w:val="left"/>
+      <w:pPr>
+        <w:tabs>
+          <w:tab w:val="num" w:pos="720"/>
+        </w:tabs>
+        <w:ind w:left="720" w:hanging="360"/>
+      </w:pPr>
+      <w:rPr>
+        <w:rFonts w:ascii="Symbol" w:hAnsi="Symbol" w:hint="default"/>
+        <w:sz w:val="20"/>
+      </w:rPr>
+    </w:lvl>
+    <w:lvl w:ilvl="1" w:tentative="1">
+      <w:start w:val="1"/>
+      <w:numFmt w:val="bullet"/>
+      <w:lvlText w:val="o"/>
+      <w:lvlJc w:val="left"/>
+      <w:pPr>
+        <w:tabs>
+          <w:tab w:val="num" w:pos="1440"/>
+        </w:tabs>
+        <w:ind w:left="1440" w:hanging="360"/>
+      </w:pPr>
+      <w:rPr>
+        <w:rFonts w:ascii="Courier New" w:hAnsi="Courier New" w:hint="default"/>
+        <w:sz w:val="20"/>
+      </w:rPr>
+    </w:lvl>
+    <w:lvl w:ilvl="2" w:tentative="1">
+      <w:start w:val="1"/>
+      <w:numFmt w:val="bullet"/>
+      <w:lvlText w:val=""/>
+      <w:lvlJc w:val="left"/>
+      <w:pPr>
+        <w:tabs>
+          <w:tab w:val="num" w:pos="2160"/>
+        </w:tabs>
+        <w:ind w:left="2160" w:hanging="360"/>
+      </w:pPr>
+      <w:rPr>
+        <w:rFonts w:ascii="Wingdings" w:hAnsi="Wingdings" w:hint="default"/>
+        <w:sz w:val="20"/>
+      </w:rPr>
+    </w:lvl>
+    <w:lvl w:ilvl="3" w:tentative="1">
+      <w:start w:val="1"/>
+      <w:numFmt w:val="bullet"/>
+      <w:lvlText w:val=""/>
+      <w:lvlJc w:val="left"/>
+      <w:pPr>
+        <w:tabs>
+          <w:tab w:val="num" w:pos="2880"/>
+        </w:tabs>
+        <w:ind w:left="2880" w:hanging="360"/>
+      </w:pPr>
+      <w:rPr>
+        <w:rFonts w:ascii="Wingdings" w:hAnsi="Wingdings" w:hint="default"/>
+        <w:sz w:val="20"/>
+      </w:rPr>
+    </w:lvl>
+    <w:lvl w:ilvl="4" w:tentative="1">
+      <w:start w:val="1"/>
+      <w:numFmt w:val="bullet"/>
+      <w:lvlText w:val=""/>
+      <w:lvlJc w:val="left"/>
+      <w:pPr>
+        <w:tabs>
+          <w:tab w:val="num" w:pos="3600"/>
+        </w:tabs>
+        <w:ind w:left="3600" w:hanging="360"/>
+      </w:pPr>
+      <w:rPr>
+        <w:rFonts w:ascii="Wingdings" w:hAnsi="Wingdings" w:hint="default"/>
+        <w:sz w:val="20"/>
+      </w:rPr>
+    </w:lvl>
+    <w:lvl w:ilvl="5" w:tentative="1">
+      <w:start w:val="1"/>
+      <w:numFmt w:val="bullet"/>
+      <w:lvlText w:val=""/>
+      <w:lvlJc w:val="left"/>
+      <w:pPr>
+        <w:tabs>
+          <w:tab w:val="num" w:pos="4320"/>
+        </w:tabs>
+        <w:ind w:left="4320" w:hanging="360"/>
+      </w:pPr>
+      <w:rPr>
+        <w:rFonts w:ascii="Wingdings" w:hAnsi="Wingdings" w:hint="default"/>
+        <w:sz w:val="20"/>
+      </w:rPr>
+    </w:lvl>
+    <w:lvl w:ilvl="6" w:tentative="1">
+      <w:start w:val="1"/>
+      <w:numFmt w:val="bullet"/>
+      <w:lvlText w:val=""/>
+      <w:lvlJc w:val="left"/>
+      <w:pPr>
+        <w:tabs>
+          <w:tab w:val="num" w:pos="5040"/>
+        </w:tabs>
+        <w:ind w:left="5040" w:hanging="360"/>
+      </w:pPr>
+      <w:rPr>
+        <w:rFonts w:ascii="Wingdings" w:hAnsi="Wingdings" w:hint="default"/>
+        <w:sz w:val="20"/>
+      </w:rPr>
+    </w:lvl>
+    <w:lvl w:ilvl="7" w:tentative="1">
+      <w:start w:val="1"/>
+      <w:numFmt w:val="bullet"/>
+      <w:lvlText w:val=""/>
+      <w:lvlJc w:val="left"/>
+      <w:pPr>
+        <w:tabs>
+          <w:tab w:val="num" w:pos="5760"/>
+        </w:tabs>
+        <w:ind w:left="5760" w:hanging="360"/>
+      </w:pPr>
+      <w:rPr>
+        <w:rFonts w:ascii="Wingdings" w:hAnsi="Wingdings" w:hint="default"/>
+        <w:sz w:val="20"/>
+      </w:rPr>
+    </w:lvl>
+    <w:lvl w:ilvl="8" w:tentative="1">
+      <w:start w:val="1"/>
+      <w:numFmt w:val="bullet"/>
+      <w:lvlText w:val=""/>
+      <w:lvlJc w:val="left"/>
+      <w:pPr>
+        <w:tabs>
+          <w:tab w:val="num" w:pos="6480"/>
+        </w:tabs>
+        <w:ind w:left="6480" w:hanging="360"/>
+      </w:pPr>
+      <w:rPr>
+        <w:rFonts w:ascii="Wingdings" w:hAnsi="Wingdings" w:hint="default"/>
+        <w:sz w:val="20"/>
+      </w:rPr>
+    </w:lvl>
+  </w:abstractNum>
+  <w:abstractNum w:abstractNumId="5" w15:restartNumberingAfterBreak="0">
+    <w:nsid w:val="22F70D1E"/>
+    <w:multiLevelType w:val="hybridMultilevel"/>
+    <w:tmpl w:val="B816AA6A"/>
+    <w:lvl w:ilvl="0" w:tplc="04090001">
+      <w:start w:val="1"/>
+      <w:numFmt w:val="bullet"/>
+      <w:lvlText w:val=""/>
+      <w:lvlJc w:val="left"/>
+      <w:pPr>
+        <w:ind w:left="720" w:hanging="360"/>
+      </w:pPr>
+      <w:rPr>
+        <w:rFonts w:ascii="Symbol" w:hAnsi="Symbol" w:hint="default"/>
+      </w:rPr>
+    </w:lvl>
+    <w:lvl w:ilvl="1" w:tplc="04090003" w:tentative="1">
+      <w:start w:val="1"/>
+      <w:numFmt w:val="bullet"/>
+      <w:lvlText w:val="o"/>
+      <w:lvlJc w:val="left"/>
+      <w:pPr>
+        <w:ind w:left="1440" w:hanging="360"/>
+      </w:pPr>
+      <w:rPr>
+        <w:rFonts w:ascii="Courier New" w:hAnsi="Courier New" w:cs="Courier New" w:hint="default"/>
+      </w:rPr>
+    </w:lvl>
+    <w:lvl w:ilvl="2" w:tplc="04090005" w:tentative="1">
+      <w:start w:val="1"/>
+      <w:numFmt w:val="bullet"/>
+      <w:lvlText w:val=""/>
+      <w:lvlJc w:val="left"/>
+      <w:pPr>
+        <w:ind w:left="2160" w:hanging="360"/>
+      </w:pPr>
+      <w:rPr>
+        <w:rFonts w:ascii="Wingdings" w:hAnsi="Wingdings" w:hint="default"/>
+      </w:rPr>
+    </w:lvl>
+    <w:lvl w:ilvl="3" w:tplc="04090001" w:tentative="1">
+      <w:start w:val="1"/>
+      <w:numFmt w:val="bullet"/>
+      <w:lvlText w:val=""/>
+      <w:lvlJc w:val="left"/>
+      <w:pPr>
+        <w:ind w:left="2880" w:hanging="360"/>
+      </w:pPr>
+      <w:rPr>
+        <w:rFonts w:ascii="Symbol" w:hAnsi="Symbol" w:hint="default"/>
+      </w:rPr>
+    </w:lvl>
+    <w:lvl w:ilvl="4" w:tplc="04090003" w:tentative="1">
+      <w:start w:val="1"/>
+      <w:numFmt w:val="bullet"/>
+      <w:lvlText w:val="o"/>
+      <w:lvlJc w:val="left"/>
+      <w:pPr>
+        <w:ind w:left="3600" w:hanging="360"/>
+      </w:pPr>
+      <w:rPr>
+        <w:rFonts w:ascii="Courier New" w:hAnsi="Courier New" w:cs="Courier New" w:hint="default"/>
+      </w:rPr>
+    </w:lvl>
+    <w:lvl w:ilvl="5" w:tplc="04090005" w:tentative="1">
+      <w:start w:val="1"/>
+      <w:numFmt w:val="bullet"/>
+      <w:lvlText w:val=""/>
+      <w:lvlJc w:val="left"/>
+      <w:pPr>
+        <w:ind w:left="4320" w:hanging="360"/>
+      </w:pPr>
+      <w:rPr>
+        <w:rFonts w:ascii="Wingdings" w:hAnsi="Wingdings" w:hint="default"/>
+      </w:rPr>
+    </w:lvl>
+    <w:lvl w:ilvl="6" w:tplc="04090001" w:tentative="1">
+      <w:start w:val="1"/>
+      <w:numFmt w:val="bullet"/>
+      <w:lvlText w:val=""/>
+      <w:lvlJc w:val="left"/>
+      <w:pPr>
+        <w:ind w:left="5040" w:hanging="360"/>
+      </w:pPr>
+      <w:rPr>
+        <w:rFonts w:ascii="Symbol" w:hAnsi="Symbol" w:hint="default"/>
+      </w:rPr>
+    </w:lvl>
+    <w:lvl w:ilvl="7" w:tplc="04090003" w:tentative="1">
+      <w:start w:val="1"/>
+      <w:numFmt w:val="bullet"/>
+      <w:lvlText w:val="o"/>
+      <w:lvlJc w:val="left"/>
+      <w:pPr>
+        <w:ind w:left="5760" w:hanging="360"/>
+      </w:pPr>
+      <w:rPr>
+        <w:rFonts w:ascii="Courier New" w:hAnsi="Courier New" w:cs="Courier New" w:hint="default"/>
+      </w:rPr>
+    </w:lvl>
+    <w:lvl w:ilvl="8" w:tplc="04090005" w:tentative="1">
+      <w:start w:val="1"/>
+      <w:numFmt w:val="bullet"/>
+      <w:lvlText w:val=""/>
+      <w:lvlJc w:val="left"/>
+      <w:pPr>
+        <w:ind w:left="6480" w:hanging="360"/>
+      </w:pPr>
+      <w:rPr>
+        <w:rFonts w:ascii="Wingdings" w:hAnsi="Wingdings" w:hint="default"/>
+      </w:rPr>
+    </w:lvl>
+  </w:abstractNum>
+  <w:abstractNum w:abstractNumId="6" w15:restartNumberingAfterBreak="0">
     <w:nsid w:val="28B02E7E"/>
     <w:multiLevelType w:val="multilevel"/>
     <w:tmpl w:val="DA50EA92"/>
@@ -2023,7 +3703,156 @@
       </w:rPr>
     </w:lvl>
   </w:abstractNum>
-  <w:abstractNum w:abstractNumId="3" w15:restartNumberingAfterBreak="0">
+  <w:abstractNum w:abstractNumId="7" w15:restartNumberingAfterBreak="0">
+    <w:nsid w:val="2C99352F"/>
+    <w:multiLevelType w:val="multilevel"/>
+    <w:tmpl w:val="18DE6F3C"/>
+    <w:lvl w:ilvl="0">
+      <w:start w:val="1"/>
+      <w:numFmt w:val="bullet"/>
+      <w:lvlText w:val=""/>
+      <w:lvlJc w:val="left"/>
+      <w:pPr>
+        <w:tabs>
+          <w:tab w:val="num" w:pos="720"/>
+        </w:tabs>
+        <w:ind w:left="720" w:hanging="360"/>
+      </w:pPr>
+      <w:rPr>
+        <w:rFonts w:ascii="Symbol" w:hAnsi="Symbol" w:hint="default"/>
+        <w:sz w:val="20"/>
+      </w:rPr>
+    </w:lvl>
+    <w:lvl w:ilvl="1" w:tentative="1">
+      <w:start w:val="1"/>
+      <w:numFmt w:val="bullet"/>
+      <w:lvlText w:val="o"/>
+      <w:lvlJc w:val="left"/>
+      <w:pPr>
+        <w:tabs>
+          <w:tab w:val="num" w:pos="1440"/>
+        </w:tabs>
+        <w:ind w:left="1440" w:hanging="360"/>
+      </w:pPr>
+      <w:rPr>
+        <w:rFonts w:ascii="Courier New" w:hAnsi="Courier New" w:hint="default"/>
+        <w:sz w:val="20"/>
+      </w:rPr>
+    </w:lvl>
+    <w:lvl w:ilvl="2" w:tentative="1">
+      <w:start w:val="1"/>
+      <w:numFmt w:val="bullet"/>
+      <w:lvlText w:val=""/>
+      <w:lvlJc w:val="left"/>
+      <w:pPr>
+        <w:tabs>
+          <w:tab w:val="num" w:pos="2160"/>
+        </w:tabs>
+        <w:ind w:left="2160" w:hanging="360"/>
+      </w:pPr>
+      <w:rPr>
+        <w:rFonts w:ascii="Wingdings" w:hAnsi="Wingdings" w:hint="default"/>
+        <w:sz w:val="20"/>
+      </w:rPr>
+    </w:lvl>
+    <w:lvl w:ilvl="3" w:tentative="1">
+      <w:start w:val="1"/>
+      <w:numFmt w:val="bullet"/>
+      <w:lvlText w:val=""/>
+      <w:lvlJc w:val="left"/>
+      <w:pPr>
+        <w:tabs>
+          <w:tab w:val="num" w:pos="2880"/>
+        </w:tabs>
+        <w:ind w:left="2880" w:hanging="360"/>
+      </w:pPr>
+      <w:rPr>
+        <w:rFonts w:ascii="Wingdings" w:hAnsi="Wingdings" w:hint="default"/>
+        <w:sz w:val="20"/>
+      </w:rPr>
+    </w:lvl>
+    <w:lvl w:ilvl="4" w:tentative="1">
+      <w:start w:val="1"/>
+      <w:numFmt w:val="bullet"/>
+      <w:lvlText w:val=""/>
+      <w:lvlJc w:val="left"/>
+      <w:pPr>
+        <w:tabs>
+          <w:tab w:val="num" w:pos="3600"/>
+        </w:tabs>
+        <w:ind w:left="3600" w:hanging="360"/>
+      </w:pPr>
+      <w:rPr>
+        <w:rFonts w:ascii="Wingdings" w:hAnsi="Wingdings" w:hint="default"/>
+        <w:sz w:val="20"/>
+      </w:rPr>
+    </w:lvl>
+    <w:lvl w:ilvl="5" w:tentative="1">
+      <w:start w:val="1"/>
+      <w:numFmt w:val="bullet"/>
+      <w:lvlText w:val=""/>
+      <w:lvlJc w:val="left"/>
+      <w:pPr>
+        <w:tabs>
+          <w:tab w:val="num" w:pos="4320"/>
+        </w:tabs>
+        <w:ind w:left="4320" w:hanging="360"/>
+      </w:pPr>
+      <w:rPr>
+        <w:rFonts w:ascii="Wingdings" w:hAnsi="Wingdings" w:hint="default"/>
+        <w:sz w:val="20"/>
+      </w:rPr>
+    </w:lvl>
+    <w:lvl w:ilvl="6" w:tentative="1">
+      <w:start w:val="1"/>
+      <w:numFmt w:val="bullet"/>
+      <w:lvlText w:val=""/>
+      <w:lvlJc w:val="left"/>
+      <w:pPr>
+        <w:tabs>
+          <w:tab w:val="num" w:pos="5040"/>
+        </w:tabs>
+        <w:ind w:left="5040" w:hanging="360"/>
+      </w:pPr>
+      <w:rPr>
+        <w:rFonts w:ascii="Wingdings" w:hAnsi="Wingdings" w:hint="default"/>
+        <w:sz w:val="20"/>
+      </w:rPr>
+    </w:lvl>
+    <w:lvl w:ilvl="7" w:tentative="1">
+      <w:start w:val="1"/>
+      <w:numFmt w:val="bullet"/>
+      <w:lvlText w:val=""/>
+      <w:lvlJc w:val="left"/>
+      <w:pPr>
+        <w:tabs>
+          <w:tab w:val="num" w:pos="5760"/>
+        </w:tabs>
+        <w:ind w:left="5760" w:hanging="360"/>
+      </w:pPr>
+      <w:rPr>
+        <w:rFonts w:ascii="Wingdings" w:hAnsi="Wingdings" w:hint="default"/>
+        <w:sz w:val="20"/>
+      </w:rPr>
+    </w:lvl>
+    <w:lvl w:ilvl="8" w:tentative="1">
+      <w:start w:val="1"/>
+      <w:numFmt w:val="bullet"/>
+      <w:lvlText w:val=""/>
+      <w:lvlJc w:val="left"/>
+      <w:pPr>
+        <w:tabs>
+          <w:tab w:val="num" w:pos="6480"/>
+        </w:tabs>
+        <w:ind w:left="6480" w:hanging="360"/>
+      </w:pPr>
+      <w:rPr>
+        <w:rFonts w:ascii="Wingdings" w:hAnsi="Wingdings" w:hint="default"/>
+        <w:sz w:val="20"/>
+      </w:rPr>
+    </w:lvl>
+  </w:abstractNum>
+  <w:abstractNum w:abstractNumId="8" w15:restartNumberingAfterBreak="0">
     <w:nsid w:val="4B1656C8"/>
     <w:multiLevelType w:val="multilevel"/>
     <w:tmpl w:val="D916D428"/>
@@ -2136,7 +3965,120 @@
       </w:rPr>
     </w:lvl>
   </w:abstractNum>
-  <w:abstractNum w:abstractNumId="4" w15:restartNumberingAfterBreak="0">
+  <w:abstractNum w:abstractNumId="9" w15:restartNumberingAfterBreak="0">
+    <w:nsid w:val="525A154E"/>
+    <w:multiLevelType w:val="hybridMultilevel"/>
+    <w:tmpl w:val="09D4811A"/>
+    <w:lvl w:ilvl="0" w:tplc="04090001">
+      <w:start w:val="1"/>
+      <w:numFmt w:val="bullet"/>
+      <w:lvlText w:val=""/>
+      <w:lvlJc w:val="left"/>
+      <w:pPr>
+        <w:ind w:left="720" w:hanging="360"/>
+      </w:pPr>
+      <w:rPr>
+        <w:rFonts w:ascii="Symbol" w:hAnsi="Symbol" w:hint="default"/>
+      </w:rPr>
+    </w:lvl>
+    <w:lvl w:ilvl="1" w:tplc="04090003" w:tentative="1">
+      <w:start w:val="1"/>
+      <w:numFmt w:val="bullet"/>
+      <w:lvlText w:val="o"/>
+      <w:lvlJc w:val="left"/>
+      <w:pPr>
+        <w:ind w:left="1440" w:hanging="360"/>
+      </w:pPr>
+      <w:rPr>
+        <w:rFonts w:ascii="Courier New" w:hAnsi="Courier New" w:cs="Courier New" w:hint="default"/>
+      </w:rPr>
+    </w:lvl>
+    <w:lvl w:ilvl="2" w:tplc="04090005" w:tentative="1">
+      <w:start w:val="1"/>
+      <w:numFmt w:val="bullet"/>
+      <w:lvlText w:val=""/>
+      <w:lvlJc w:val="left"/>
+      <w:pPr>
+        <w:ind w:left="2160" w:hanging="360"/>
+      </w:pPr>
+      <w:rPr>
+        <w:rFonts w:ascii="Wingdings" w:hAnsi="Wingdings" w:hint="default"/>
+      </w:rPr>
+    </w:lvl>
+    <w:lvl w:ilvl="3" w:tplc="04090001" w:tentative="1">
+      <w:start w:val="1"/>
+      <w:numFmt w:val="bullet"/>
+      <w:lvlText w:val=""/>
+      <w:lvlJc w:val="left"/>
+      <w:pPr>
+        <w:ind w:left="2880" w:hanging="360"/>
+      </w:pPr>
+      <w:rPr>
+        <w:rFonts w:ascii="Symbol" w:hAnsi="Symbol" w:hint="default"/>
+      </w:rPr>
+    </w:lvl>
+    <w:lvl w:ilvl="4" w:tplc="04090003" w:tentative="1">
+      <w:start w:val="1"/>
+      <w:numFmt w:val="bullet"/>
+      <w:lvlText w:val="o"/>
+      <w:lvlJc w:val="left"/>
+      <w:pPr>
+        <w:ind w:left="3600" w:hanging="360"/>
+      </w:pPr>
+      <w:rPr>
+        <w:rFonts w:ascii="Courier New" w:hAnsi="Courier New" w:cs="Courier New" w:hint="default"/>
+      </w:rPr>
+    </w:lvl>
+    <w:lvl w:ilvl="5" w:tplc="04090005" w:tentative="1">
+      <w:start w:val="1"/>
+      <w:numFmt w:val="bullet"/>
+      <w:lvlText w:val=""/>
+      <w:lvlJc w:val="left"/>
+      <w:pPr>
+        <w:ind w:left="4320" w:hanging="360"/>
+      </w:pPr>
+      <w:rPr>
+        <w:rFonts w:ascii="Wingdings" w:hAnsi="Wingdings" w:hint="default"/>
+      </w:rPr>
+    </w:lvl>
+    <w:lvl w:ilvl="6" w:tplc="04090001" w:tentative="1">
+      <w:start w:val="1"/>
+      <w:numFmt w:val="bullet"/>
+      <w:lvlText w:val=""/>
+      <w:lvlJc w:val="left"/>
+      <w:pPr>
+        <w:ind w:left="5040" w:hanging="360"/>
+      </w:pPr>
+      <w:rPr>
+        <w:rFonts w:ascii="Symbol" w:hAnsi="Symbol" w:hint="default"/>
+      </w:rPr>
+    </w:lvl>
+    <w:lvl w:ilvl="7" w:tplc="04090003" w:tentative="1">
+      <w:start w:val="1"/>
+      <w:numFmt w:val="bullet"/>
+      <w:lvlText w:val="o"/>
+      <w:lvlJc w:val="left"/>
+      <w:pPr>
+        <w:ind w:left="5760" w:hanging="360"/>
+      </w:pPr>
+      <w:rPr>
+        <w:rFonts w:ascii="Courier New" w:hAnsi="Courier New" w:cs="Courier New" w:hint="default"/>
+      </w:rPr>
+    </w:lvl>
+    <w:lvl w:ilvl="8" w:tplc="04090005" w:tentative="1">
+      <w:start w:val="1"/>
+      <w:numFmt w:val="bullet"/>
+      <w:lvlText w:val=""/>
+      <w:lvlJc w:val="left"/>
+      <w:pPr>
+        <w:ind w:left="6480" w:hanging="360"/>
+      </w:pPr>
+      <w:rPr>
+        <w:rFonts w:ascii="Wingdings" w:hAnsi="Wingdings" w:hint="default"/>
+      </w:rPr>
+    </w:lvl>
+  </w:abstractNum>
+  <w:abstractNum w:abstractNumId="10" w15:restartNumberingAfterBreak="0">
     <w:nsid w:val="5621658B"/>
     <w:multiLevelType w:val="hybridMultilevel"/>
     <w:tmpl w:val="92A8BBBE"/>
@@ -2249,7 +4191,382 @@
       </w:rPr>
     </w:lvl>
   </w:abstractNum>
-  <w:abstractNum w:abstractNumId="5" w15:restartNumberingAfterBreak="0">
+  <w:abstractNum w:abstractNumId="11" w15:restartNumberingAfterBreak="0">
+    <w:nsid w:val="58074505"/>
+    <w:multiLevelType w:val="hybridMultilevel"/>
+    <w:tmpl w:val="4D60C814"/>
+    <w:lvl w:ilvl="0" w:tplc="04090001">
+      <w:start w:val="1"/>
+      <w:numFmt w:val="bullet"/>
+      <w:lvlText w:val=""/>
+      <w:lvlJc w:val="left"/>
+      <w:pPr>
+        <w:ind w:left="720" w:hanging="360"/>
+      </w:pPr>
+      <w:rPr>
+        <w:rFonts w:ascii="Symbol" w:hAnsi="Symbol" w:hint="default"/>
+      </w:rPr>
+    </w:lvl>
+    <w:lvl w:ilvl="1" w:tplc="04090003" w:tentative="1">
+      <w:start w:val="1"/>
+      <w:numFmt w:val="bullet"/>
+      <w:lvlText w:val="o"/>
+      <w:lvlJc w:val="left"/>
+      <w:pPr>
+        <w:ind w:left="1440" w:hanging="360"/>
+      </w:pPr>
+      <w:rPr>
+        <w:rFonts w:ascii="Courier New" w:hAnsi="Courier New" w:cs="Courier New" w:hint="default"/>
+      </w:rPr>
+    </w:lvl>
+    <w:lvl w:ilvl="2" w:tplc="04090005" w:tentative="1">
+      <w:start w:val="1"/>
+      <w:numFmt w:val="bullet"/>
+      <w:lvlText w:val=""/>
+      <w:lvlJc w:val="left"/>
+      <w:pPr>
+        <w:ind w:left="2160" w:hanging="360"/>
+      </w:pPr>
+      <w:rPr>
+        <w:rFonts w:ascii="Wingdings" w:hAnsi="Wingdings" w:hint="default"/>
+      </w:rPr>
+    </w:lvl>
+    <w:lvl w:ilvl="3" w:tplc="04090001" w:tentative="1">
+      <w:start w:val="1"/>
+      <w:numFmt w:val="bullet"/>
+      <w:lvlText w:val=""/>
+      <w:lvlJc w:val="left"/>
+      <w:pPr>
+        <w:ind w:left="2880" w:hanging="360"/>
+      </w:pPr>
+      <w:rPr>
+        <w:rFonts w:ascii="Symbol" w:hAnsi="Symbol" w:hint="default"/>
+      </w:rPr>
+    </w:lvl>
+    <w:lvl w:ilvl="4" w:tplc="04090003" w:tentative="1">
+      <w:start w:val="1"/>
+      <w:numFmt w:val="bullet"/>
+      <w:lvlText w:val="o"/>
+      <w:lvlJc w:val="left"/>
+      <w:pPr>
+        <w:ind w:left="3600" w:hanging="360"/>
+      </w:pPr>
+      <w:rPr>
+        <w:rFonts w:ascii="Courier New" w:hAnsi="Courier New" w:cs="Courier New" w:hint="default"/>
+      </w:rPr>
+    </w:lvl>
+    <w:lvl w:ilvl="5" w:tplc="04090005" w:tentative="1">
+      <w:start w:val="1"/>
+      <w:numFmt w:val="bullet"/>
+      <w:lvlText w:val=""/>
+      <w:lvlJc w:val="left"/>
+      <w:pPr>
+        <w:ind w:left="4320" w:hanging="360"/>
+      </w:pPr>
+      <w:rPr>
+        <w:rFonts w:ascii="Wingdings" w:hAnsi="Wingdings" w:hint="default"/>
+      </w:rPr>
+    </w:lvl>
+    <w:lvl w:ilvl="6" w:tplc="04090001" w:tentative="1">
+      <w:start w:val="1"/>
+      <w:numFmt w:val="bullet"/>
+      <w:lvlText w:val=""/>
+      <w:lvlJc w:val="left"/>
+      <w:pPr>
+        <w:ind w:left="5040" w:hanging="360"/>
+      </w:pPr>
+      <w:rPr>
+        <w:rFonts w:ascii="Symbol" w:hAnsi="Symbol" w:hint="default"/>
+      </w:rPr>
+    </w:lvl>
+    <w:lvl w:ilvl="7" w:tplc="04090003" w:tentative="1">
+      <w:start w:val="1"/>
+      <w:numFmt w:val="bullet"/>
+      <w:lvlText w:val="o"/>
+      <w:lvlJc w:val="left"/>
+      <w:pPr>
+        <w:ind w:left="5760" w:hanging="360"/>
+      </w:pPr>
+      <w:rPr>
+        <w:rFonts w:ascii="Courier New" w:hAnsi="Courier New" w:cs="Courier New" w:hint="default"/>
+      </w:rPr>
+    </w:lvl>
+    <w:lvl w:ilvl="8" w:tplc="04090005" w:tentative="1">
+      <w:start w:val="1"/>
+      <w:numFmt w:val="bullet"/>
+      <w:lvlText w:val=""/>
+      <w:lvlJc w:val="left"/>
+      <w:pPr>
+        <w:ind w:left="6480" w:hanging="360"/>
+      </w:pPr>
+      <w:rPr>
+        <w:rFonts w:ascii="Wingdings" w:hAnsi="Wingdings" w:hint="default"/>
+      </w:rPr>
+    </w:lvl>
+  </w:abstractNum>
+  <w:abstractNum w:abstractNumId="12" w15:restartNumberingAfterBreak="0">
+    <w:nsid w:val="5DC0648C"/>
+    <w:multiLevelType w:val="hybridMultilevel"/>
+    <w:tmpl w:val="53AA064C"/>
+    <w:lvl w:ilvl="0" w:tplc="04090001">
+      <w:start w:val="1"/>
+      <w:numFmt w:val="bullet"/>
+      <w:lvlText w:val=""/>
+      <w:lvlJc w:val="left"/>
+      <w:pPr>
+        <w:ind w:left="720" w:hanging="360"/>
+      </w:pPr>
+      <w:rPr>
+        <w:rFonts w:ascii="Symbol" w:hAnsi="Symbol" w:hint="default"/>
+      </w:rPr>
+    </w:lvl>
+    <w:lvl w:ilvl="1" w:tplc="04090003" w:tentative="1">
+      <w:start w:val="1"/>
+      <w:numFmt w:val="bullet"/>
+      <w:lvlText w:val="o"/>
+      <w:lvlJc w:val="left"/>
+      <w:pPr>
+        <w:ind w:left="1440" w:hanging="360"/>
+      </w:pPr>
+      <w:rPr>
+        <w:rFonts w:ascii="Courier New" w:hAnsi="Courier New" w:cs="Courier New" w:hint="default"/>
+      </w:rPr>
+    </w:lvl>
+    <w:lvl w:ilvl="2" w:tplc="04090005" w:tentative="1">
+      <w:start w:val="1"/>
+      <w:numFmt w:val="bullet"/>
+      <w:lvlText w:val=""/>
+      <w:lvlJc w:val="left"/>
+      <w:pPr>
+        <w:ind w:left="2160" w:hanging="360"/>
+      </w:pPr>
+      <w:rPr>
+        <w:rFonts w:ascii="Wingdings" w:hAnsi="Wingdings" w:hint="default"/>
+      </w:rPr>
+    </w:lvl>
+    <w:lvl w:ilvl="3" w:tplc="04090001" w:tentative="1">
+      <w:start w:val="1"/>
+      <w:numFmt w:val="bullet"/>
+      <w:lvlText w:val=""/>
+      <w:lvlJc w:val="left"/>
+      <w:pPr>
+        <w:ind w:left="2880" w:hanging="360"/>
+      </w:pPr>
+      <w:rPr>
+        <w:rFonts w:ascii="Symbol" w:hAnsi="Symbol" w:hint="default"/>
+      </w:rPr>
+    </w:lvl>
+    <w:lvl w:ilvl="4" w:tplc="04090003" w:tentative="1">
+      <w:start w:val="1"/>
+      <w:numFmt w:val="bullet"/>
+      <w:lvlText w:val="o"/>
+      <w:lvlJc w:val="left"/>
+      <w:pPr>
+        <w:ind w:left="3600" w:hanging="360"/>
+      </w:pPr>
+      <w:rPr>
+        <w:rFonts w:ascii="Courier New" w:hAnsi="Courier New" w:cs="Courier New" w:hint="default"/>
+      </w:rPr>
+    </w:lvl>
+    <w:lvl w:ilvl="5" w:tplc="04090005" w:tentative="1">
+      <w:start w:val="1"/>
+      <w:numFmt w:val="bullet"/>
+      <w:lvlText w:val=""/>
+      <w:lvlJc w:val="left"/>
+      <w:pPr>
+        <w:ind w:left="4320" w:hanging="360"/>
+      </w:pPr>
+      <w:rPr>
+        <w:rFonts w:ascii="Wingdings" w:hAnsi="Wingdings" w:hint="default"/>
+      </w:rPr>
+    </w:lvl>
+    <w:lvl w:ilvl="6" w:tplc="04090001" w:tentative="1">
+      <w:start w:val="1"/>
+      <w:numFmt w:val="bullet"/>
+      <w:lvlText w:val=""/>
+      <w:lvlJc w:val="left"/>
+      <w:pPr>
+        <w:ind w:left="5040" w:hanging="360"/>
+      </w:pPr>
+      <w:rPr>
+        <w:rFonts w:ascii="Symbol" w:hAnsi="Symbol" w:hint="default"/>
+      </w:rPr>
+    </w:lvl>
+    <w:lvl w:ilvl="7" w:tplc="04090003" w:tentative="1">
+      <w:start w:val="1"/>
+      <w:numFmt w:val="bullet"/>
+      <w:lvlText w:val="o"/>
+      <w:lvlJc w:val="left"/>
+      <w:pPr>
+        <w:ind w:left="5760" w:hanging="360"/>
+      </w:pPr>
+      <w:rPr>
+        <w:rFonts w:ascii="Courier New" w:hAnsi="Courier New" w:cs="Courier New" w:hint="default"/>
+      </w:rPr>
+    </w:lvl>
+    <w:lvl w:ilvl="8" w:tplc="04090005" w:tentative="1">
+      <w:start w:val="1"/>
+      <w:numFmt w:val="bullet"/>
+      <w:lvlText w:val=""/>
+      <w:lvlJc w:val="left"/>
+      <w:pPr>
+        <w:ind w:left="6480" w:hanging="360"/>
+      </w:pPr>
+      <w:rPr>
+        <w:rFonts w:ascii="Wingdings" w:hAnsi="Wingdings" w:hint="default"/>
+      </w:rPr>
+    </w:lvl>
+  </w:abstractNum>
+  <w:abstractNum w:abstractNumId="13" w15:restartNumberingAfterBreak="0">
+    <w:nsid w:val="6F1725D2"/>
+    <w:multiLevelType w:val="multilevel"/>
+    <w:tmpl w:val="18DE6F3C"/>
+    <w:lvl w:ilvl="0">
+      <w:start w:val="1"/>
+      <w:numFmt w:val="bullet"/>
+      <w:lvlText w:val=""/>
+      <w:lvlJc w:val="left"/>
+      <w:pPr>
+        <w:tabs>
+          <w:tab w:val="num" w:pos="720"/>
+        </w:tabs>
+        <w:ind w:left="720" w:hanging="360"/>
+      </w:pPr>
+      <w:rPr>
+        <w:rFonts w:ascii="Symbol" w:hAnsi="Symbol" w:hint="default"/>
+        <w:sz w:val="20"/>
+      </w:rPr>
+    </w:lvl>
+    <w:lvl w:ilvl="1" w:tentative="1">
+      <w:start w:val="1"/>
+      <w:numFmt w:val="bullet"/>
+      <w:lvlText w:val="o"/>
+      <w:lvlJc w:val="left"/>
+      <w:pPr>
+        <w:tabs>
+          <w:tab w:val="num" w:pos="1440"/>
+        </w:tabs>
+        <w:ind w:left="1440" w:hanging="360"/>
+      </w:pPr>
+      <w:rPr>
+        <w:rFonts w:ascii="Courier New" w:hAnsi="Courier New" w:hint="default"/>
+        <w:sz w:val="20"/>
+      </w:rPr>
+    </w:lvl>
+    <w:lvl w:ilvl="2" w:tentative="1">
+      <w:start w:val="1"/>
+      <w:numFmt w:val="bullet"/>
+      <w:lvlText w:val=""/>
+      <w:lvlJc w:val="left"/>
+      <w:pPr>
+        <w:tabs>
+          <w:tab w:val="num" w:pos="2160"/>
+        </w:tabs>
+        <w:ind w:left="2160" w:hanging="360"/>
+      </w:pPr>
+      <w:rPr>
+        <w:rFonts w:ascii="Wingdings" w:hAnsi="Wingdings" w:hint="default"/>
+        <w:sz w:val="20"/>
+      </w:rPr>
+    </w:lvl>
+    <w:lvl w:ilvl="3" w:tentative="1">
+      <w:start w:val="1"/>
+      <w:numFmt w:val="bullet"/>
+      <w:lvlText w:val=""/>
+      <w:lvlJc w:val="left"/>
+      <w:pPr>
+        <w:tabs>
+          <w:tab w:val="num" w:pos="2880"/>
+        </w:tabs>
+        <w:ind w:left="2880" w:hanging="360"/>
+      </w:pPr>
+      <w:rPr>
+        <w:rFonts w:ascii="Wingdings" w:hAnsi="Wingdings" w:hint="default"/>
+        <w:sz w:val="20"/>
+      </w:rPr>
+    </w:lvl>
+    <w:lvl w:ilvl="4" w:tentative="1">
+      <w:start w:val="1"/>
+      <w:numFmt w:val="bullet"/>
+      <w:lvlText w:val=""/>
+      <w:lvlJc w:val="left"/>
+      <w:pPr>
+        <w:tabs>
+          <w:tab w:val="num" w:pos="3600"/>
+        </w:tabs>
+        <w:ind w:left="3600" w:hanging="360"/>
+      </w:pPr>
+      <w:rPr>
+        <w:rFonts w:ascii="Wingdings" w:hAnsi="Wingdings" w:hint="default"/>
+        <w:sz w:val="20"/>
+      </w:rPr>
+    </w:lvl>
+    <w:lvl w:ilvl="5" w:tentative="1">
+      <w:start w:val="1"/>
+      <w:numFmt w:val="bullet"/>
+      <w:lvlText w:val=""/>
+      <w:lvlJc w:val="left"/>
+      <w:pPr>
+        <w:tabs>
+          <w:tab w:val="num" w:pos="4320"/>
+        </w:tabs>
+        <w:ind w:left="4320" w:hanging="360"/>
+      </w:pPr>
+      <w:rPr>
+        <w:rFonts w:ascii="Wingdings" w:hAnsi="Wingdings" w:hint="default"/>
+        <w:sz w:val="20"/>
+      </w:rPr>
+    </w:lvl>
+    <w:lvl w:ilvl="6" w:tentative="1">
+      <w:start w:val="1"/>
+      <w:numFmt w:val="bullet"/>
+      <w:lvlText w:val=""/>
+      <w:lvlJc w:val="left"/>
+      <w:pPr>
+        <w:tabs>
+          <w:tab w:val="num" w:pos="5040"/>
+        </w:tabs>
+        <w:ind w:left="5040" w:hanging="360"/>
+      </w:pPr>
+      <w:rPr>
+        <w:rFonts w:ascii="Wingdings" w:hAnsi="Wingdings" w:hint="default"/>
+        <w:sz w:val="20"/>
+      </w:rPr>
+    </w:lvl>
+    <w:lvl w:ilvl="7" w:tentative="1">
+      <w:start w:val="1"/>
+      <w:numFmt w:val="bullet"/>
+      <w:lvlText w:val=""/>
+      <w:lvlJc w:val="left"/>
+      <w:pPr>
+        <w:tabs>
+          <w:tab w:val="num" w:pos="5760"/>
+        </w:tabs>
+        <w:ind w:left="5760" w:hanging="360"/>
+      </w:pPr>
+      <w:rPr>
+        <w:rFonts w:ascii="Wingdings" w:hAnsi="Wingdings" w:hint="default"/>
+        <w:sz w:val="20"/>
+      </w:rPr>
+    </w:lvl>
+    <w:lvl w:ilvl="8" w:tentative="1">
+      <w:start w:val="1"/>
+      <w:numFmt w:val="bullet"/>
+      <w:lvlText w:val=""/>
+      <w:lvlJc w:val="left"/>
+      <w:pPr>
+        <w:tabs>
+          <w:tab w:val="num" w:pos="6480"/>
+        </w:tabs>
+        <w:ind w:left="6480" w:hanging="360"/>
+      </w:pPr>
+      <w:rPr>
+        <w:rFonts w:ascii="Wingdings" w:hAnsi="Wingdings" w:hint="default"/>
+        <w:sz w:val="20"/>
+      </w:rPr>
+    </w:lvl>
+  </w:abstractNum>
+  <w:abstractNum w:abstractNumId="14" w15:restartNumberingAfterBreak="0">
     <w:nsid w:val="704D058B"/>
     <w:multiLevelType w:val="multilevel"/>
     <w:tmpl w:val="F1F4BB42"/>
@@ -2362,7 +4679,7 @@
       </w:rPr>
     </w:lvl>
   </w:abstractNum>
-  <w:abstractNum w:abstractNumId="6" w15:restartNumberingAfterBreak="0">
+  <w:abstractNum w:abstractNumId="15" w15:restartNumberingAfterBreak="0">
     <w:nsid w:val="723C46C7"/>
     <w:multiLevelType w:val="hybridMultilevel"/>
     <w:tmpl w:val="0DF82030"/>
@@ -2475,7 +4792,156 @@
       </w:rPr>
     </w:lvl>
   </w:abstractNum>
-  <w:abstractNum w:abstractNumId="7" w15:restartNumberingAfterBreak="0">
+  <w:abstractNum w:abstractNumId="16" w15:restartNumberingAfterBreak="0">
+    <w:nsid w:val="77BB246E"/>
+    <w:multiLevelType w:val="multilevel"/>
+    <w:tmpl w:val="18DE6F3C"/>
+    <w:lvl w:ilvl="0">
+      <w:start w:val="1"/>
+      <w:numFmt w:val="bullet"/>
+      <w:lvlText w:val=""/>
+      <w:lvlJc w:val="left"/>
+      <w:pPr>
+        <w:tabs>
+          <w:tab w:val="num" w:pos="720"/>
+        </w:tabs>
+        <w:ind w:left="720" w:hanging="360"/>
+      </w:pPr>
+      <w:rPr>
+        <w:rFonts w:ascii="Symbol" w:hAnsi="Symbol" w:hint="default"/>
+        <w:sz w:val="20"/>
+      </w:rPr>
+    </w:lvl>
+    <w:lvl w:ilvl="1" w:tentative="1">
+      <w:start w:val="1"/>
+      <w:numFmt w:val="bullet"/>
+      <w:lvlText w:val="o"/>
+      <w:lvlJc w:val="left"/>
+      <w:pPr>
+        <w:tabs>
+          <w:tab w:val="num" w:pos="1440"/>
+        </w:tabs>
+        <w:ind w:left="1440" w:hanging="360"/>
+      </w:pPr>
+      <w:rPr>
+        <w:rFonts w:ascii="Courier New" w:hAnsi="Courier New" w:hint="default"/>
+        <w:sz w:val="20"/>
+      </w:rPr>
+    </w:lvl>
+    <w:lvl w:ilvl="2" w:tentative="1">
+      <w:start w:val="1"/>
+      <w:numFmt w:val="bullet"/>
+      <w:lvlText w:val=""/>
+      <w:lvlJc w:val="left"/>
+      <w:pPr>
+        <w:tabs>
+          <w:tab w:val="num" w:pos="2160"/>
+        </w:tabs>
+        <w:ind w:left="2160" w:hanging="360"/>
+      </w:pPr>
+      <w:rPr>
+        <w:rFonts w:ascii="Wingdings" w:hAnsi="Wingdings" w:hint="default"/>
+        <w:sz w:val="20"/>
+      </w:rPr>
+    </w:lvl>
+    <w:lvl w:ilvl="3" w:tentative="1">
+      <w:start w:val="1"/>
+      <w:numFmt w:val="bullet"/>
+      <w:lvlText w:val=""/>
+      <w:lvlJc w:val="left"/>
+      <w:pPr>
+        <w:tabs>
+          <w:tab w:val="num" w:pos="2880"/>
+        </w:tabs>
+        <w:ind w:left="2880" w:hanging="360"/>
+      </w:pPr>
+      <w:rPr>
+        <w:rFonts w:ascii="Wingdings" w:hAnsi="Wingdings" w:hint="default"/>
+        <w:sz w:val="20"/>
+      </w:rPr>
+    </w:lvl>
+    <w:lvl w:ilvl="4" w:tentative="1">
+      <w:start w:val="1"/>
+      <w:numFmt w:val="bullet"/>
+      <w:lvlText w:val=""/>
+      <w:lvlJc w:val="left"/>
+      <w:pPr>
+        <w:tabs>
+          <w:tab w:val="num" w:pos="3600"/>
+        </w:tabs>
+        <w:ind w:left="3600" w:hanging="360"/>
+      </w:pPr>
+      <w:rPr>
+        <w:rFonts w:ascii="Wingdings" w:hAnsi="Wingdings" w:hint="default"/>
+        <w:sz w:val="20"/>
+      </w:rPr>
+    </w:lvl>
+    <w:lvl w:ilvl="5" w:tentative="1">
+      <w:start w:val="1"/>
+      <w:numFmt w:val="bullet"/>
+      <w:lvlText w:val=""/>
+      <w:lvlJc w:val="left"/>
+      <w:pPr>
+        <w:tabs>
+          <w:tab w:val="num" w:pos="4320"/>
+        </w:tabs>
+        <w:ind w:left="4320" w:hanging="360"/>
+      </w:pPr>
+      <w:rPr>
+        <w:rFonts w:ascii="Wingdings" w:hAnsi="Wingdings" w:hint="default"/>
+        <w:sz w:val="20"/>
+      </w:rPr>
+    </w:lvl>
+    <w:lvl w:ilvl="6" w:tentative="1">
+      <w:start w:val="1"/>
+      <w:numFmt w:val="bullet"/>
+      <w:lvlText w:val=""/>
+      <w:lvlJc w:val="left"/>
+      <w:pPr>
+        <w:tabs>
+          <w:tab w:val="num" w:pos="5040"/>
+        </w:tabs>
+        <w:ind w:left="5040" w:hanging="360"/>
+      </w:pPr>
+      <w:rPr>
+        <w:rFonts w:ascii="Wingdings" w:hAnsi="Wingdings" w:hint="default"/>
+        <w:sz w:val="20"/>
+      </w:rPr>
+    </w:lvl>
+    <w:lvl w:ilvl="7" w:tentative="1">
+      <w:start w:val="1"/>
+      <w:numFmt w:val="bullet"/>
+      <w:lvlText w:val=""/>
+      <w:lvlJc w:val="left"/>
+      <w:pPr>
+        <w:tabs>
+          <w:tab w:val="num" w:pos="5760"/>
+        </w:tabs>
+        <w:ind w:left="5760" w:hanging="360"/>
+      </w:pPr>
+      <w:rPr>
+        <w:rFonts w:ascii="Wingdings" w:hAnsi="Wingdings" w:hint="default"/>
+        <w:sz w:val="20"/>
+      </w:rPr>
+    </w:lvl>
+    <w:lvl w:ilvl="8" w:tentative="1">
+      <w:start w:val="1"/>
+      <w:numFmt w:val="bullet"/>
+      <w:lvlText w:val=""/>
+      <w:lvlJc w:val="left"/>
+      <w:pPr>
+        <w:tabs>
+          <w:tab w:val="num" w:pos="6480"/>
+        </w:tabs>
+        <w:ind w:left="6480" w:hanging="360"/>
+      </w:pPr>
+      <w:rPr>
+        <w:rFonts w:ascii="Wingdings" w:hAnsi="Wingdings" w:hint="default"/>
+        <w:sz w:val="20"/>
+      </w:rPr>
+    </w:lvl>
+  </w:abstractNum>
+  <w:abstractNum w:abstractNumId="17" w15:restartNumberingAfterBreak="0">
     <w:nsid w:val="79544BD9"/>
     <w:multiLevelType w:val="multilevel"/>
     <w:tmpl w:val="29A89BCC"/>
@@ -2589,7 +5055,7 @@
       </w:rPr>
     </w:lvl>
   </w:abstractNum>
-  <w:abstractNum w:abstractNumId="8" w15:restartNumberingAfterBreak="0">
+  <w:abstractNum w:abstractNumId="18" w15:restartNumberingAfterBreak="0">
     <w:nsid w:val="7E445A8B"/>
     <w:multiLevelType w:val="multilevel"/>
     <w:tmpl w:val="407C2E5A"/>
@@ -2703,31 +5169,61 @@
     </w:lvl>
   </w:abstractNum>
   <w:num w:numId="1" w16cid:durableId="1692953631">
+    <w:abstractNumId w:val="18"/>
+  </w:num>
+  <w:num w:numId="2" w16cid:durableId="1577014827">
     <w:abstractNumId w:val="8"/>
   </w:num>
-  <w:num w:numId="2" w16cid:durableId="1577014827">
+  <w:num w:numId="3" w16cid:durableId="22220197">
+    <w:abstractNumId w:val="17"/>
+  </w:num>
+  <w:num w:numId="4" w16cid:durableId="1604344107">
+    <w:abstractNumId w:val="6"/>
+  </w:num>
+  <w:num w:numId="5" w16cid:durableId="1663773802">
+    <w:abstractNumId w:val="2"/>
+  </w:num>
+  <w:num w:numId="6" w16cid:durableId="123279372">
+    <w:abstractNumId w:val="14"/>
+  </w:num>
+  <w:num w:numId="7" w16cid:durableId="697973729">
+    <w:abstractNumId w:val="15"/>
+  </w:num>
+  <w:num w:numId="8" w16cid:durableId="1091511296">
+    <w:abstractNumId w:val="10"/>
+  </w:num>
+  <w:num w:numId="9" w16cid:durableId="770315398">
+    <w:abstractNumId w:val="1"/>
+  </w:num>
+  <w:num w:numId="10" w16cid:durableId="1626427487">
+    <w:abstractNumId w:val="5"/>
+  </w:num>
+  <w:num w:numId="11" w16cid:durableId="921642825">
+    <w:abstractNumId w:val="9"/>
+  </w:num>
+  <w:num w:numId="12" w16cid:durableId="1444180789">
     <w:abstractNumId w:val="3"/>
   </w:num>
-  <w:num w:numId="3" w16cid:durableId="22220197">
+  <w:num w:numId="13" w16cid:durableId="82067625">
+    <w:abstractNumId w:val="12"/>
+  </w:num>
+  <w:num w:numId="14" w16cid:durableId="1527478039">
+    <w:abstractNumId w:val="0"/>
+  </w:num>
+  <w:num w:numId="15" w16cid:durableId="1869021963">
     <w:abstractNumId w:val="7"/>
   </w:num>
-  <w:num w:numId="4" w16cid:durableId="1604344107">
-    <w:abstractNumId w:val="2"/>
+  <w:num w:numId="16" w16cid:durableId="80415650">
+    <w:abstractNumId w:val="13"/>
   </w:num>
-  <w:num w:numId="5" w16cid:durableId="1663773802">
-    <w:abstractNumId w:val="1"/>
+  <w:num w:numId="17" w16cid:durableId="208538577">
+    <w:abstractNumId w:val="16"/>
   </w:num>
-  <w:num w:numId="6" w16cid:durableId="123279372">
-    <w:abstractNumId w:val="5"/>
-  </w:num>
-  <w:num w:numId="7" w16cid:durableId="697973729">
-    <w:abstractNumId w:val="6"/>
-  </w:num>
-  <w:num w:numId="8" w16cid:durableId="1091511296">
+  <w:num w:numId="18" w16cid:durableId="1503468262">
     <w:abstractNumId w:val="4"/>
   </w:num>
-  <w:num w:numId="9" w16cid:durableId="770315398">
-    <w:abstractNumId w:val="0"/>
+  <w:num w:numId="19" w16cid:durableId="1902013599">
+    <w:abstractNumId w:val="11"/>
   </w:num>
 </w:numbering>
 </file>

</xml_diff>